<commit_message>
Plantilla v2: sin hoja en blanco al final y renglones más compactos
- Llenado: limpiarFinal_ quita los párrafos vacíos del final (dejaban una
  hoja en blanco) y las listas llevan poco espacio entre elementos.
- Plantilla: se quitan los renglones vacíos después de la tabla de firmas y
  la columna «Responsable» del control de cambios es más ancha.

Co-Authored-By: Claude Opus 5.5 <noreply@anthropic.com>
</commit_message>
<xml_diff>
--- a/plantillas/Procedimiento.docx
+++ b/plantillas/Procedimiento.docx
@@ -505,10 +505,10 @@
         <w:tblLook w:val="0000" w:firstRow="0" w:lastRow="0" w:firstColumn="0" w:lastColumn="0" w:noHBand="0" w:noVBand="0"/>
       </w:tblPr>
       <w:tblGrid>
+        <w:gridCol w:w="1040"/>
         <w:gridCol w:w="1240"/>
-        <w:gridCol w:w="1560"/>
-        <w:gridCol w:w="4600"/>
-        <w:gridCol w:w="1957"/>
+        <w:gridCol w:w="4520"/>
+        <w:gridCol w:w="2557"/>
       </w:tblGrid>
       <w:tr>
         <w:tblPrEx>
@@ -522,7 +522,7 @@
         </w:trPr>
         <w:tc>
           <w:tcPr>
-            <w:tcW w:w="1240" w:type="dxa"/>
+            <w:tcW w:w="1040" w:type="dxa"/>
             <w:shd w:val="clear" w:color="auto" w:fill="auto"/>
             <w:vAlign w:val="center"/>
           </w:tcPr>
@@ -552,7 +552,7 @@
         </w:tc>
         <w:tc>
           <w:tcPr>
-            <w:tcW w:w="1560" w:type="dxa"/>
+            <w:tcW w:w="1240" w:type="dxa"/>
             <w:shd w:val="clear" w:color="auto" w:fill="auto"/>
             <w:vAlign w:val="center"/>
           </w:tcPr>
@@ -582,7 +582,7 @@
         </w:tc>
         <w:tc>
           <w:tcPr>
-            <w:tcW w:w="4600" w:type="dxa"/>
+            <w:tcW w:w="4520" w:type="dxa"/>
             <w:shd w:val="clear" w:color="auto" w:fill="auto"/>
             <w:vAlign w:val="center"/>
           </w:tcPr>
@@ -612,7 +612,7 @@
         </w:tc>
         <w:tc>
           <w:tcPr>
-            <w:tcW w:w="1957" w:type="dxa"/>
+            <w:tcW w:w="2557" w:type="dxa"/>
             <w:shd w:val="clear" w:color="auto" w:fill="auto"/>
             <w:vAlign w:val="center"/>
           </w:tcPr>
@@ -650,7 +650,7 @@
         </w:tblPrEx>
         <w:tc>
           <w:tcPr>
-            <w:tcW w:w="1240" w:type="dxa"/>
+            <w:tcW w:w="1040" w:type="dxa"/>
             <w:shd w:val="clear" w:color="auto" w:fill="auto"/>
             <w:vAlign w:val="center"/>
           </w:tcPr>
@@ -678,7 +678,7 @@
         </w:tc>
         <w:tc>
           <w:tcPr>
-            <w:tcW w:w="1560" w:type="dxa"/>
+            <w:tcW w:w="1240" w:type="dxa"/>
             <w:shd w:val="clear" w:color="auto" w:fill="auto"/>
             <w:vAlign w:val="center"/>
           </w:tcPr>
@@ -706,7 +706,7 @@
         </w:tc>
         <w:tc>
           <w:tcPr>
-            <w:tcW w:w="4600" w:type="dxa"/>
+            <w:tcW w:w="4520" w:type="dxa"/>
             <w:shd w:val="clear" w:color="auto" w:fill="auto"/>
             <w:vAlign w:val="center"/>
           </w:tcPr>
@@ -733,7 +733,7 @@
         </w:tc>
         <w:tc>
           <w:tcPr>
-            <w:tcW w:w="1957" w:type="dxa"/>
+            <w:tcW w:w="2557" w:type="dxa"/>
             <w:shd w:val="clear" w:color="auto" w:fill="auto"/>
             <w:vAlign w:val="center"/>
           </w:tcPr>
@@ -867,6 +867,7 @@
                 <w:sz w:val="14"/>
                 <w:szCs w:val="14"/>
               </w:rPr>
+              <w:lastRenderedPageBreak/>
               <w:t>Elaborado por</w:t>
             </w:r>
           </w:p>
@@ -1215,12 +1216,12 @@
           <w:right w:val="nil"/>
           <w:between w:val="nil"/>
         </w:pBdr>
-        <w:spacing w:line="276" w:lineRule="auto"/>
+        <w:spacing w:line="20" w:lineRule="exact"/>
         <w:rPr>
           <w:b/>
           <w:bCs/>
           <w:color w:val="06263A"/>
-          <w:sz w:val="20"/>
+          <w:sz w:val="2"/>
           <w:szCs w:val="20"/>
         </w:rPr>
       </w:pPr>
@@ -1984,7 +1985,7 @@
   <w:abstractNum w:abstractNumId="0" w15:restartNumberingAfterBreak="0">
     <w:nsid w:val="FFFFFF7C"/>
     <w:multiLevelType w:val="singleLevel"/>
-    <w:tmpl w:val="B57E4918"/>
+    <w:tmpl w:val="D5DE2F8A"/>
     <w:lvl w:ilvl="0">
       <w:start w:val="1"/>
       <w:numFmt w:val="decimal"/>
@@ -2002,7 +2003,7 @@
   <w:abstractNum w:abstractNumId="1" w15:restartNumberingAfterBreak="0">
     <w:nsid w:val="FFFFFF7D"/>
     <w:multiLevelType w:val="singleLevel"/>
-    <w:tmpl w:val="B7805E76"/>
+    <w:tmpl w:val="C980D780"/>
     <w:lvl w:ilvl="0">
       <w:start w:val="1"/>
       <w:numFmt w:val="decimal"/>
@@ -2020,7 +2021,7 @@
   <w:abstractNum w:abstractNumId="2" w15:restartNumberingAfterBreak="0">
     <w:nsid w:val="FFFFFF7E"/>
     <w:multiLevelType w:val="singleLevel"/>
-    <w:tmpl w:val="F912B08A"/>
+    <w:tmpl w:val="4628CF7A"/>
     <w:lvl w:ilvl="0">
       <w:start w:val="1"/>
       <w:numFmt w:val="decimal"/>
@@ -2038,7 +2039,7 @@
   <w:abstractNum w:abstractNumId="3" w15:restartNumberingAfterBreak="0">
     <w:nsid w:val="FFFFFF7F"/>
     <w:multiLevelType w:val="singleLevel"/>
-    <w:tmpl w:val="D6A0776C"/>
+    <w:tmpl w:val="35B6FB70"/>
     <w:lvl w:ilvl="0">
       <w:start w:val="1"/>
       <w:numFmt w:val="decimal"/>
@@ -2056,7 +2057,7 @@
   <w:abstractNum w:abstractNumId="4" w15:restartNumberingAfterBreak="0">
     <w:nsid w:val="FFFFFF80"/>
     <w:multiLevelType w:val="singleLevel"/>
-    <w:tmpl w:val="98127426"/>
+    <w:tmpl w:val="BBAA20DA"/>
     <w:lvl w:ilvl="0">
       <w:start w:val="1"/>
       <w:numFmt w:val="bullet"/>
@@ -2077,7 +2078,7 @@
   <w:abstractNum w:abstractNumId="5" w15:restartNumberingAfterBreak="0">
     <w:nsid w:val="FFFFFF81"/>
     <w:multiLevelType w:val="singleLevel"/>
-    <w:tmpl w:val="F7CAC6E2"/>
+    <w:tmpl w:val="08529F44"/>
     <w:lvl w:ilvl="0">
       <w:start w:val="1"/>
       <w:numFmt w:val="bullet"/>
@@ -2098,7 +2099,7 @@
   <w:abstractNum w:abstractNumId="6" w15:restartNumberingAfterBreak="0">
     <w:nsid w:val="FFFFFF82"/>
     <w:multiLevelType w:val="singleLevel"/>
-    <w:tmpl w:val="D4FC55BE"/>
+    <w:tmpl w:val="6CD8287A"/>
     <w:lvl w:ilvl="0">
       <w:start w:val="1"/>
       <w:numFmt w:val="bullet"/>
@@ -2119,7 +2120,7 @@
   <w:abstractNum w:abstractNumId="7" w15:restartNumberingAfterBreak="0">
     <w:nsid w:val="FFFFFF83"/>
     <w:multiLevelType w:val="singleLevel"/>
-    <w:tmpl w:val="562AE272"/>
+    <w:tmpl w:val="6F6CED82"/>
     <w:lvl w:ilvl="0">
       <w:start w:val="1"/>
       <w:numFmt w:val="bullet"/>
@@ -2140,7 +2141,7 @@
   <w:abstractNum w:abstractNumId="8" w15:restartNumberingAfterBreak="0">
     <w:nsid w:val="FFFFFF88"/>
     <w:multiLevelType w:val="singleLevel"/>
-    <w:tmpl w:val="998405F6"/>
+    <w:tmpl w:val="EF1241F4"/>
     <w:lvl w:ilvl="0">
       <w:start w:val="1"/>
       <w:numFmt w:val="decimal"/>
@@ -2158,7 +2159,7 @@
   <w:abstractNum w:abstractNumId="9" w15:restartNumberingAfterBreak="0">
     <w:nsid w:val="FFFFFF89"/>
     <w:multiLevelType w:val="singleLevel"/>
-    <w:tmpl w:val="02944806"/>
+    <w:tmpl w:val="DC00724A"/>
     <w:lvl w:ilvl="0">
       <w:start w:val="1"/>
       <w:numFmt w:val="bullet"/>
@@ -2398,7 +2399,94 @@
     </w:lvl>
   </w:abstractNum>
   <w:abstractNum w:abstractNumId="11" w15:restartNumberingAfterBreak="0">
-    <w:nsid w:val="0FAB3D2D"/>
+    <w:nsid w:val="1B78711B"/>
+    <w:multiLevelType w:val="multilevel"/>
+    <w:tmpl w:val="080A001F"/>
+    <w:styleLink w:val="111111"/>
+    <w:lvl w:ilvl="0">
+      <w:start w:val="1"/>
+      <w:numFmt w:val="decimal"/>
+      <w:lvlText w:val="%1."/>
+      <w:lvlJc w:val="left"/>
+      <w:pPr>
+        <w:ind w:left="360" w:hanging="360"/>
+      </w:pPr>
+    </w:lvl>
+    <w:lvl w:ilvl="1">
+      <w:start w:val="1"/>
+      <w:numFmt w:val="decimal"/>
+      <w:lvlText w:val="%1.%2."/>
+      <w:lvlJc w:val="left"/>
+      <w:pPr>
+        <w:ind w:left="792" w:hanging="432"/>
+      </w:pPr>
+    </w:lvl>
+    <w:lvl w:ilvl="2">
+      <w:start w:val="1"/>
+      <w:numFmt w:val="decimal"/>
+      <w:lvlText w:val="%1.%2.%3."/>
+      <w:lvlJc w:val="left"/>
+      <w:pPr>
+        <w:ind w:left="1224" w:hanging="504"/>
+      </w:pPr>
+    </w:lvl>
+    <w:lvl w:ilvl="3">
+      <w:start w:val="1"/>
+      <w:numFmt w:val="decimal"/>
+      <w:lvlText w:val="%1.%2.%3.%4."/>
+      <w:lvlJc w:val="left"/>
+      <w:pPr>
+        <w:ind w:left="1728" w:hanging="648"/>
+      </w:pPr>
+    </w:lvl>
+    <w:lvl w:ilvl="4">
+      <w:start w:val="1"/>
+      <w:numFmt w:val="decimal"/>
+      <w:lvlText w:val="%1.%2.%3.%4.%5."/>
+      <w:lvlJc w:val="left"/>
+      <w:pPr>
+        <w:ind w:left="2232" w:hanging="792"/>
+      </w:pPr>
+    </w:lvl>
+    <w:lvl w:ilvl="5">
+      <w:start w:val="1"/>
+      <w:numFmt w:val="decimal"/>
+      <w:lvlText w:val="%1.%2.%3.%4.%5.%6."/>
+      <w:lvlJc w:val="left"/>
+      <w:pPr>
+        <w:ind w:left="2736" w:hanging="936"/>
+      </w:pPr>
+    </w:lvl>
+    <w:lvl w:ilvl="6">
+      <w:start w:val="1"/>
+      <w:numFmt w:val="decimal"/>
+      <w:lvlText w:val="%1.%2.%3.%4.%5.%6.%7."/>
+      <w:lvlJc w:val="left"/>
+      <w:pPr>
+        <w:ind w:left="3240" w:hanging="1080"/>
+      </w:pPr>
+    </w:lvl>
+    <w:lvl w:ilvl="7">
+      <w:start w:val="1"/>
+      <w:numFmt w:val="decimal"/>
+      <w:lvlText w:val="%1.%2.%3.%4.%5.%6.%7.%8."/>
+      <w:lvlJc w:val="left"/>
+      <w:pPr>
+        <w:ind w:left="3744" w:hanging="1224"/>
+      </w:pPr>
+    </w:lvl>
+    <w:lvl w:ilvl="8">
+      <w:start w:val="1"/>
+      <w:numFmt w:val="decimal"/>
+      <w:lvlText w:val="%1.%2.%3.%4.%5.%6.%7.%8.%9."/>
+      <w:lvlJc w:val="left"/>
+      <w:pPr>
+        <w:ind w:left="4320" w:hanging="1440"/>
+      </w:pPr>
+    </w:lvl>
+  </w:abstractNum>
+  <w:abstractNum w:abstractNumId="12" w15:restartNumberingAfterBreak="0">
+    <w:nsid w:val="49E941C3"/>
     <w:multiLevelType w:val="multilevel"/>
     <w:tmpl w:val="080A0023"/>
     <w:styleLink w:val="ArtculoSeccin"/>
@@ -2494,8 +2582,121 @@
       </w:pPr>
     </w:lvl>
   </w:abstractNum>
-  <w:abstractNum w:abstractNumId="12" w15:restartNumberingAfterBreak="0">
-    <w:nsid w:val="52705264"/>
+  <w:abstractNum w:abstractNumId="13" w15:restartNumberingAfterBreak="0">
+    <w:nsid w:val="531225FB"/>
+    <w:multiLevelType w:val="hybridMultilevel"/>
+    <w:tmpl w:val="7EECB05E"/>
+    <w:lvl w:ilvl="0" w:tplc="080A0001">
+      <w:start w:val="1"/>
+      <w:numFmt w:val="bullet"/>
+      <w:lvlText w:val=""/>
+      <w:lvlJc w:val="left"/>
+      <w:pPr>
+        <w:ind w:left="153" w:hanging="360"/>
+      </w:pPr>
+      <w:rPr>
+        <w:rFonts w:ascii="Symbol" w:hAnsi="Symbol" w:hint="default"/>
+      </w:rPr>
+    </w:lvl>
+    <w:lvl w:ilvl="1" w:tplc="080A0003" w:tentative="1">
+      <w:start w:val="1"/>
+      <w:numFmt w:val="bullet"/>
+      <w:lvlText w:val="o"/>
+      <w:lvlJc w:val="left"/>
+      <w:pPr>
+        <w:ind w:left="873" w:hanging="360"/>
+      </w:pPr>
+      <w:rPr>
+        <w:rFonts w:ascii="Courier New" w:hAnsi="Courier New" w:cs="Courier New" w:hint="default"/>
+      </w:rPr>
+    </w:lvl>
+    <w:lvl w:ilvl="2" w:tplc="080A0005" w:tentative="1">
+      <w:start w:val="1"/>
+      <w:numFmt w:val="bullet"/>
+      <w:lvlText w:val=""/>
+      <w:lvlJc w:val="left"/>
+      <w:pPr>
+        <w:ind w:left="1593" w:hanging="360"/>
+      </w:pPr>
+      <w:rPr>
+        <w:rFonts w:ascii="Wingdings" w:hAnsi="Wingdings" w:hint="default"/>
+      </w:rPr>
+    </w:lvl>
+    <w:lvl w:ilvl="3" w:tplc="080A0001" w:tentative="1">
+      <w:start w:val="1"/>
+      <w:numFmt w:val="bullet"/>
+      <w:lvlText w:val=""/>
+      <w:lvlJc w:val="left"/>
+      <w:pPr>
+        <w:ind w:left="2313" w:hanging="360"/>
+      </w:pPr>
+      <w:rPr>
+        <w:rFonts w:ascii="Symbol" w:hAnsi="Symbol" w:hint="default"/>
+      </w:rPr>
+    </w:lvl>
+    <w:lvl w:ilvl="4" w:tplc="080A0003" w:tentative="1">
+      <w:start w:val="1"/>
+      <w:numFmt w:val="bullet"/>
+      <w:lvlText w:val="o"/>
+      <w:lvlJc w:val="left"/>
+      <w:pPr>
+        <w:ind w:left="3033" w:hanging="360"/>
+      </w:pPr>
+      <w:rPr>
+        <w:rFonts w:ascii="Courier New" w:hAnsi="Courier New" w:cs="Courier New" w:hint="default"/>
+      </w:rPr>
+    </w:lvl>
+    <w:lvl w:ilvl="5" w:tplc="080A0005" w:tentative="1">
+      <w:start w:val="1"/>
+      <w:numFmt w:val="bullet"/>
+      <w:lvlText w:val=""/>
+      <w:lvlJc w:val="left"/>
+      <w:pPr>
+        <w:ind w:left="3753" w:hanging="360"/>
+      </w:pPr>
+      <w:rPr>
+        <w:rFonts w:ascii="Wingdings" w:hAnsi="Wingdings" w:hint="default"/>
+      </w:rPr>
+    </w:lvl>
+    <w:lvl w:ilvl="6" w:tplc="080A0001" w:tentative="1">
+      <w:start w:val="1"/>
+      <w:numFmt w:val="bullet"/>
+      <w:lvlText w:val=""/>
+      <w:lvlJc w:val="left"/>
+      <w:pPr>
+        <w:ind w:left="4473" w:hanging="360"/>
+      </w:pPr>
+      <w:rPr>
+        <w:rFonts w:ascii="Symbol" w:hAnsi="Symbol" w:hint="default"/>
+      </w:rPr>
+    </w:lvl>
+    <w:lvl w:ilvl="7" w:tplc="080A0003" w:tentative="1">
+      <w:start w:val="1"/>
+      <w:numFmt w:val="bullet"/>
+      <w:lvlText w:val="o"/>
+      <w:lvlJc w:val="left"/>
+      <w:pPr>
+        <w:ind w:left="5193" w:hanging="360"/>
+      </w:pPr>
+      <w:rPr>
+        <w:rFonts w:ascii="Courier New" w:hAnsi="Courier New" w:cs="Courier New" w:hint="default"/>
+      </w:rPr>
+    </w:lvl>
+    <w:lvl w:ilvl="8" w:tplc="080A0005" w:tentative="1">
+      <w:start w:val="1"/>
+      <w:numFmt w:val="bullet"/>
+      <w:lvlText w:val=""/>
+      <w:lvlJc w:val="left"/>
+      <w:pPr>
+        <w:ind w:left="5913" w:hanging="360"/>
+      </w:pPr>
+      <w:rPr>
+        <w:rFonts w:ascii="Wingdings" w:hAnsi="Wingdings" w:hint="default"/>
+      </w:rPr>
+    </w:lvl>
+  </w:abstractNum>
+  <w:abstractNum w:abstractNumId="14" w15:restartNumberingAfterBreak="0">
+    <w:nsid w:val="585A2D80"/>
     <w:multiLevelType w:val="multilevel"/>
     <w:tmpl w:val="080A001D"/>
     <w:styleLink w:val="1ai"/>
@@ -2581,206 +2782,6 @@
       </w:pPr>
     </w:lvl>
   </w:abstractNum>
-  <w:abstractNum w:abstractNumId="13" w15:restartNumberingAfterBreak="0">
-    <w:nsid w:val="531225FB"/>
-    <w:multiLevelType w:val="hybridMultilevel"/>
-    <w:tmpl w:val="7EECB05E"/>
-    <w:lvl w:ilvl="0" w:tplc="080A0001">
-      <w:start w:val="1"/>
-      <w:numFmt w:val="bullet"/>
-      <w:lvlText w:val=""/>
-      <w:lvlJc w:val="left"/>
-      <w:pPr>
-        <w:ind w:left="153" w:hanging="360"/>
-      </w:pPr>
-      <w:rPr>
-        <w:rFonts w:ascii="Symbol" w:hAnsi="Symbol" w:hint="default"/>
-      </w:rPr>
-    </w:lvl>
-    <w:lvl w:ilvl="1" w:tplc="080A0003" w:tentative="1">
-      <w:start w:val="1"/>
-      <w:numFmt w:val="bullet"/>
-      <w:lvlText w:val="o"/>
-      <w:lvlJc w:val="left"/>
-      <w:pPr>
-        <w:ind w:left="873" w:hanging="360"/>
-      </w:pPr>
-      <w:rPr>
-        <w:rFonts w:ascii="Courier New" w:hAnsi="Courier New" w:cs="Courier New" w:hint="default"/>
-      </w:rPr>
-    </w:lvl>
-    <w:lvl w:ilvl="2" w:tplc="080A0005" w:tentative="1">
-      <w:start w:val="1"/>
-      <w:numFmt w:val="bullet"/>
-      <w:lvlText w:val=""/>
-      <w:lvlJc w:val="left"/>
-      <w:pPr>
-        <w:ind w:left="1593" w:hanging="360"/>
-      </w:pPr>
-      <w:rPr>
-        <w:rFonts w:ascii="Wingdings" w:hAnsi="Wingdings" w:hint="default"/>
-      </w:rPr>
-    </w:lvl>
-    <w:lvl w:ilvl="3" w:tplc="080A0001" w:tentative="1">
-      <w:start w:val="1"/>
-      <w:numFmt w:val="bullet"/>
-      <w:lvlText w:val=""/>
-      <w:lvlJc w:val="left"/>
-      <w:pPr>
-        <w:ind w:left="2313" w:hanging="360"/>
-      </w:pPr>
-      <w:rPr>
-        <w:rFonts w:ascii="Symbol" w:hAnsi="Symbol" w:hint="default"/>
-      </w:rPr>
-    </w:lvl>
-    <w:lvl w:ilvl="4" w:tplc="080A0003" w:tentative="1">
-      <w:start w:val="1"/>
-      <w:numFmt w:val="bullet"/>
-      <w:lvlText w:val="o"/>
-      <w:lvlJc w:val="left"/>
-      <w:pPr>
-        <w:ind w:left="3033" w:hanging="360"/>
-      </w:pPr>
-      <w:rPr>
-        <w:rFonts w:ascii="Courier New" w:hAnsi="Courier New" w:cs="Courier New" w:hint="default"/>
-      </w:rPr>
-    </w:lvl>
-    <w:lvl w:ilvl="5" w:tplc="080A0005" w:tentative="1">
-      <w:start w:val="1"/>
-      <w:numFmt w:val="bullet"/>
-      <w:lvlText w:val=""/>
-      <w:lvlJc w:val="left"/>
-      <w:pPr>
-        <w:ind w:left="3753" w:hanging="360"/>
-      </w:pPr>
-      <w:rPr>
-        <w:rFonts w:ascii="Wingdings" w:hAnsi="Wingdings" w:hint="default"/>
-      </w:rPr>
-    </w:lvl>
-    <w:lvl w:ilvl="6" w:tplc="080A0001" w:tentative="1">
-      <w:start w:val="1"/>
-      <w:numFmt w:val="bullet"/>
-      <w:lvlText w:val=""/>
-      <w:lvlJc w:val="left"/>
-      <w:pPr>
-        <w:ind w:left="4473" w:hanging="360"/>
-      </w:pPr>
-      <w:rPr>
-        <w:rFonts w:ascii="Symbol" w:hAnsi="Symbol" w:hint="default"/>
-      </w:rPr>
-    </w:lvl>
-    <w:lvl w:ilvl="7" w:tplc="080A0003" w:tentative="1">
-      <w:start w:val="1"/>
-      <w:numFmt w:val="bullet"/>
-      <w:lvlText w:val="o"/>
-      <w:lvlJc w:val="left"/>
-      <w:pPr>
-        <w:ind w:left="5193" w:hanging="360"/>
-      </w:pPr>
-      <w:rPr>
-        <w:rFonts w:ascii="Courier New" w:hAnsi="Courier New" w:cs="Courier New" w:hint="default"/>
-      </w:rPr>
-    </w:lvl>
-    <w:lvl w:ilvl="8" w:tplc="080A0005" w:tentative="1">
-      <w:start w:val="1"/>
-      <w:numFmt w:val="bullet"/>
-      <w:lvlText w:val=""/>
-      <w:lvlJc w:val="left"/>
-      <w:pPr>
-        <w:ind w:left="5913" w:hanging="360"/>
-      </w:pPr>
-      <w:rPr>
-        <w:rFonts w:ascii="Wingdings" w:hAnsi="Wingdings" w:hint="default"/>
-      </w:rPr>
-    </w:lvl>
-  </w:abstractNum>
-  <w:abstractNum w:abstractNumId="14" w15:restartNumberingAfterBreak="0">
-    <w:nsid w:val="5F4C2CD0"/>
-    <w:multiLevelType w:val="multilevel"/>
-    <w:tmpl w:val="080A001F"/>
-    <w:styleLink w:val="111111"/>
-    <w:lvl w:ilvl="0">
-      <w:start w:val="1"/>
-      <w:numFmt w:val="decimal"/>
-      <w:lvlText w:val="%1."/>
-      <w:lvlJc w:val="left"/>
-      <w:pPr>
-        <w:ind w:left="360" w:hanging="360"/>
-      </w:pPr>
-    </w:lvl>
-    <w:lvl w:ilvl="1">
-      <w:start w:val="1"/>
-      <w:numFmt w:val="decimal"/>
-      <w:lvlText w:val="%1.%2."/>
-      <w:lvlJc w:val="left"/>
-      <w:pPr>
-        <w:ind w:left="792" w:hanging="432"/>
-      </w:pPr>
-    </w:lvl>
-    <w:lvl w:ilvl="2">
-      <w:start w:val="1"/>
-      <w:numFmt w:val="decimal"/>
-      <w:lvlText w:val="%1.%2.%3."/>
-      <w:lvlJc w:val="left"/>
-      <w:pPr>
-        <w:ind w:left="1224" w:hanging="504"/>
-      </w:pPr>
-    </w:lvl>
-    <w:lvl w:ilvl="3">
-      <w:start w:val="1"/>
-      <w:numFmt w:val="decimal"/>
-      <w:lvlText w:val="%1.%2.%3.%4."/>
-      <w:lvlJc w:val="left"/>
-      <w:pPr>
-        <w:ind w:left="1728" w:hanging="648"/>
-      </w:pPr>
-    </w:lvl>
-    <w:lvl w:ilvl="4">
-      <w:start w:val="1"/>
-      <w:numFmt w:val="decimal"/>
-      <w:lvlText w:val="%1.%2.%3.%4.%5."/>
-      <w:lvlJc w:val="left"/>
-      <w:pPr>
-        <w:ind w:left="2232" w:hanging="792"/>
-      </w:pPr>
-    </w:lvl>
-    <w:lvl w:ilvl="5">
-      <w:start w:val="1"/>
-      <w:numFmt w:val="decimal"/>
-      <w:lvlText w:val="%1.%2.%3.%4.%5.%6."/>
-      <w:lvlJc w:val="left"/>
-      <w:pPr>
-        <w:ind w:left="2736" w:hanging="936"/>
-      </w:pPr>
-    </w:lvl>
-    <w:lvl w:ilvl="6">
-      <w:start w:val="1"/>
-      <w:numFmt w:val="decimal"/>
-      <w:lvlText w:val="%1.%2.%3.%4.%5.%6.%7."/>
-      <w:lvlJc w:val="left"/>
-      <w:pPr>
-        <w:ind w:left="3240" w:hanging="1080"/>
-      </w:pPr>
-    </w:lvl>
-    <w:lvl w:ilvl="7">
-      <w:start w:val="1"/>
-      <w:numFmt w:val="decimal"/>
-      <w:lvlText w:val="%1.%2.%3.%4.%5.%6.%7.%8."/>
-      <w:lvlJc w:val="left"/>
-      <w:pPr>
-        <w:ind w:left="3744" w:hanging="1224"/>
-      </w:pPr>
-    </w:lvl>
-    <w:lvl w:ilvl="8">
-      <w:start w:val="1"/>
-      <w:numFmt w:val="decimal"/>
-      <w:lvlText w:val="%1.%2.%3.%4.%5.%6.%7.%8.%9."/>
-      <w:lvlJc w:val="left"/>
-      <w:pPr>
-        <w:ind w:left="4320" w:hanging="1440"/>
-      </w:pPr>
-    </w:lvl>
-  </w:abstractNum>
   <w:num w:numId="1">
     <w:abstractNumId w:val="10"/>
   </w:num>
@@ -2788,13 +2789,13 @@
     <w:abstractNumId w:val="13"/>
   </w:num>
   <w:num w:numId="3">
+    <w:abstractNumId w:val="11"/>
+  </w:num>
+  <w:num w:numId="4">
     <w:abstractNumId w:val="14"/>
   </w:num>
-  <w:num w:numId="4">
+  <w:num w:numId="5">
     <w:abstractNumId w:val="12"/>
-  </w:num>
-  <w:num w:numId="5">
-    <w:abstractNumId w:val="11"/>
   </w:num>
   <w:num w:numId="6">
     <w:abstractNumId w:val="8"/>
@@ -3419,7 +3420,7 @@
     <w:semiHidden/>
     <w:unhideWhenUsed/>
     <w:qFormat/>
-    <w:rsid w:val="009616FD"/>
+    <w:rsid w:val="00C272FC"/>
     <w:pPr>
       <w:keepNext/>
       <w:keepLines/>
@@ -3446,7 +3447,7 @@
     <w:semiHidden/>
     <w:unhideWhenUsed/>
     <w:qFormat/>
-    <w:rsid w:val="009616FD"/>
+    <w:rsid w:val="00C272FC"/>
     <w:pPr>
       <w:keepNext/>
       <w:keepLines/>
@@ -3473,7 +3474,7 @@
     <w:semiHidden/>
     <w:unhideWhenUsed/>
     <w:qFormat/>
-    <w:rsid w:val="009616FD"/>
+    <w:rsid w:val="00C272FC"/>
     <w:pPr>
       <w:keepNext/>
       <w:keepLines/>
@@ -3699,7 +3700,7 @@
     <w:uiPriority w:val="99"/>
     <w:semiHidden/>
     <w:unhideWhenUsed/>
-    <w:rsid w:val="009616FD"/>
+    <w:rsid w:val="00C272FC"/>
     <w:pPr>
       <w:numPr>
         <w:numId w:val="3"/>
@@ -3712,7 +3713,7 @@
     <w:uiPriority w:val="99"/>
     <w:semiHidden/>
     <w:unhideWhenUsed/>
-    <w:rsid w:val="009616FD"/>
+    <w:rsid w:val="00C272FC"/>
     <w:pPr>
       <w:numPr>
         <w:numId w:val="4"/>
@@ -3725,7 +3726,7 @@
     <w:uiPriority w:val="99"/>
     <w:semiHidden/>
     <w:unhideWhenUsed/>
-    <w:rsid w:val="009616FD"/>
+    <w:rsid w:val="00C272FC"/>
     <w:rPr>
       <w:rFonts w:ascii="Montserrat" w:hAnsi="Montserrat"/>
     </w:rPr>
@@ -3736,7 +3737,7 @@
     <w:link w:val="Ttulo7"/>
     <w:uiPriority w:val="9"/>
     <w:semiHidden/>
-    <w:rsid w:val="009616FD"/>
+    <w:rsid w:val="00C272FC"/>
     <w:rPr>
       <w:rFonts w:asciiTheme="majorHAnsi" w:eastAsiaTheme="majorEastAsia" w:hAnsiTheme="majorHAnsi" w:cstheme="majorBidi"/>
       <w:i/>
@@ -3750,7 +3751,7 @@
     <w:link w:val="Ttulo8"/>
     <w:uiPriority w:val="9"/>
     <w:semiHidden/>
-    <w:rsid w:val="009616FD"/>
+    <w:rsid w:val="00C272FC"/>
     <w:rPr>
       <w:rFonts w:asciiTheme="majorHAnsi" w:eastAsiaTheme="majorEastAsia" w:hAnsiTheme="majorHAnsi" w:cstheme="majorBidi"/>
       <w:color w:val="272727" w:themeColor="text1" w:themeTint="D8"/>
@@ -3764,7 +3765,7 @@
     <w:link w:val="Ttulo9"/>
     <w:uiPriority w:val="9"/>
     <w:semiHidden/>
-    <w:rsid w:val="009616FD"/>
+    <w:rsid w:val="00C272FC"/>
     <w:rPr>
       <w:rFonts w:asciiTheme="majorHAnsi" w:eastAsiaTheme="majorEastAsia" w:hAnsiTheme="majorHAnsi" w:cstheme="majorBidi"/>
       <w:i/>
@@ -3780,7 +3781,7 @@
     <w:uiPriority w:val="99"/>
     <w:semiHidden/>
     <w:unhideWhenUsed/>
-    <w:rsid w:val="009616FD"/>
+    <w:rsid w:val="00C272FC"/>
     <w:pPr>
       <w:numPr>
         <w:numId w:val="5"/>
@@ -3794,7 +3795,7 @@
     <w:uiPriority w:val="99"/>
     <w:semiHidden/>
     <w:unhideWhenUsed/>
-    <w:rsid w:val="009616FD"/>
+    <w:rsid w:val="00C272FC"/>
     <w:pPr>
       <w:spacing w:line="240" w:lineRule="auto"/>
     </w:pPr>
@@ -3809,7 +3810,7 @@
     <w:link w:val="Textocomentario"/>
     <w:uiPriority w:val="99"/>
     <w:semiHidden/>
-    <w:rsid w:val="009616FD"/>
+    <w:rsid w:val="00C272FC"/>
     <w:rPr>
       <w:rFonts w:ascii="Montserrat" w:hAnsi="Montserrat"/>
       <w:sz w:val="20"/>
@@ -3824,7 +3825,7 @@
     <w:uiPriority w:val="99"/>
     <w:semiHidden/>
     <w:unhideWhenUsed/>
-    <w:rsid w:val="009616FD"/>
+    <w:rsid w:val="00C272FC"/>
     <w:rPr>
       <w:b/>
       <w:bCs/>
@@ -3836,7 +3837,7 @@
     <w:link w:val="Asuntodelcomentario"/>
     <w:uiPriority w:val="99"/>
     <w:semiHidden/>
-    <w:rsid w:val="009616FD"/>
+    <w:rsid w:val="00C272FC"/>
     <w:rPr>
       <w:rFonts w:ascii="Montserrat" w:hAnsi="Montserrat"/>
       <w:b/>
@@ -3852,7 +3853,7 @@
     <w:uiPriority w:val="37"/>
     <w:semiHidden/>
     <w:unhideWhenUsed/>
-    <w:rsid w:val="009616FD"/>
+    <w:rsid w:val="00C272FC"/>
   </w:style>
   <w:style w:type="paragraph" w:styleId="Cierre">
     <w:name w:val="Closing"/>
@@ -3861,7 +3862,7 @@
     <w:uiPriority w:val="99"/>
     <w:semiHidden/>
     <w:unhideWhenUsed/>
-    <w:rsid w:val="009616FD"/>
+    <w:rsid w:val="00C272FC"/>
     <w:pPr>
       <w:spacing w:line="240" w:lineRule="auto"/>
       <w:ind w:left="4252"/>
@@ -3873,7 +3874,7 @@
     <w:link w:val="Cierre"/>
     <w:uiPriority w:val="99"/>
     <w:semiHidden/>
-    <w:rsid w:val="009616FD"/>
+    <w:rsid w:val="00C272FC"/>
     <w:rPr>
       <w:rFonts w:ascii="Montserrat" w:hAnsi="Montserrat"/>
     </w:rPr>
@@ -3885,7 +3886,7 @@
     <w:link w:val="CitaCar"/>
     <w:uiPriority w:val="29"/>
     <w:qFormat/>
-    <w:rsid w:val="009616FD"/>
+    <w:rsid w:val="00C272FC"/>
     <w:pPr>
       <w:spacing w:before="200" w:after="160"/>
       <w:ind w:left="864" w:right="864"/>
@@ -3902,7 +3903,7 @@
     <w:basedOn w:val="Fuentedeprrafopredeter"/>
     <w:link w:val="Cita"/>
     <w:uiPriority w:val="29"/>
-    <w:rsid w:val="009616FD"/>
+    <w:rsid w:val="00C272FC"/>
     <w:rPr>
       <w:rFonts w:ascii="Montserrat" w:hAnsi="Montserrat"/>
       <w:i/>
@@ -3917,7 +3918,7 @@
     <w:link w:val="CitadestacadaCar"/>
     <w:uiPriority w:val="30"/>
     <w:qFormat/>
-    <w:rsid w:val="009616FD"/>
+    <w:rsid w:val="00C272FC"/>
     <w:pPr>
       <w:pBdr>
         <w:top w:val="single" w:sz="4" w:space="10" w:color="4F81BD" w:themeColor="accent1"/>
@@ -3938,7 +3939,7 @@
     <w:basedOn w:val="Fuentedeprrafopredeter"/>
     <w:link w:val="Citadestacada"/>
     <w:uiPriority w:val="30"/>
-    <w:rsid w:val="009616FD"/>
+    <w:rsid w:val="00C272FC"/>
     <w:rPr>
       <w:rFonts w:ascii="Montserrat" w:hAnsi="Montserrat"/>
       <w:i/>
@@ -3952,7 +3953,7 @@
     <w:uiPriority w:val="99"/>
     <w:semiHidden/>
     <w:unhideWhenUsed/>
-    <w:rsid w:val="009616FD"/>
+    <w:rsid w:val="00C272FC"/>
     <w:rPr>
       <w:rFonts w:ascii="Montserrat" w:hAnsi="Montserrat"/>
       <w:i/>
@@ -3965,7 +3966,7 @@
     <w:uiPriority w:val="99"/>
     <w:semiHidden/>
     <w:unhideWhenUsed/>
-    <w:rsid w:val="009616FD"/>
+    <w:rsid w:val="00C272FC"/>
     <w:rPr>
       <w:rFonts w:ascii="Consolas" w:hAnsi="Consolas"/>
       <w:sz w:val="20"/>
@@ -3978,7 +3979,7 @@
     <w:uiPriority w:val="99"/>
     <w:semiHidden/>
     <w:unhideWhenUsed/>
-    <w:rsid w:val="009616FD"/>
+    <w:rsid w:val="00C272FC"/>
     <w:pPr>
       <w:spacing w:after="120"/>
       <w:ind w:left="283"/>
@@ -3991,7 +3992,7 @@
     <w:uiPriority w:val="99"/>
     <w:semiHidden/>
     <w:unhideWhenUsed/>
-    <w:rsid w:val="009616FD"/>
+    <w:rsid w:val="00C272FC"/>
     <w:pPr>
       <w:spacing w:after="120"/>
       <w:ind w:left="566"/>
@@ -4004,7 +4005,7 @@
     <w:uiPriority w:val="99"/>
     <w:semiHidden/>
     <w:unhideWhenUsed/>
-    <w:rsid w:val="009616FD"/>
+    <w:rsid w:val="00C272FC"/>
     <w:pPr>
       <w:spacing w:after="120"/>
       <w:ind w:left="849"/>
@@ -4017,7 +4018,7 @@
     <w:uiPriority w:val="99"/>
     <w:semiHidden/>
     <w:unhideWhenUsed/>
-    <w:rsid w:val="009616FD"/>
+    <w:rsid w:val="00C272FC"/>
     <w:pPr>
       <w:spacing w:after="120"/>
       <w:ind w:left="1132"/>
@@ -4030,7 +4031,7 @@
     <w:uiPriority w:val="99"/>
     <w:semiHidden/>
     <w:unhideWhenUsed/>
-    <w:rsid w:val="009616FD"/>
+    <w:rsid w:val="00C272FC"/>
     <w:pPr>
       <w:spacing w:after="120"/>
       <w:ind w:left="1415"/>
@@ -4043,7 +4044,7 @@
     <w:uiPriority w:val="62"/>
     <w:semiHidden/>
     <w:unhideWhenUsed/>
-    <w:rsid w:val="009616FD"/>
+    <w:rsid w:val="00C272FC"/>
     <w:pPr>
       <w:spacing w:line="240" w:lineRule="auto"/>
     </w:pPr>
@@ -4168,7 +4169,7 @@
     <w:uiPriority w:val="62"/>
     <w:semiHidden/>
     <w:unhideWhenUsed/>
-    <w:rsid w:val="009616FD"/>
+    <w:rsid w:val="00C272FC"/>
     <w:pPr>
       <w:spacing w:line="240" w:lineRule="auto"/>
     </w:pPr>
@@ -4293,7 +4294,7 @@
     <w:uiPriority w:val="62"/>
     <w:semiHidden/>
     <w:unhideWhenUsed/>
-    <w:rsid w:val="009616FD"/>
+    <w:rsid w:val="00C272FC"/>
     <w:pPr>
       <w:spacing w:line="240" w:lineRule="auto"/>
     </w:pPr>
@@ -4418,7 +4419,7 @@
     <w:uiPriority w:val="62"/>
     <w:semiHidden/>
     <w:unhideWhenUsed/>
-    <w:rsid w:val="009616FD"/>
+    <w:rsid w:val="00C272FC"/>
     <w:pPr>
       <w:spacing w:line="240" w:lineRule="auto"/>
     </w:pPr>
@@ -4543,7 +4544,7 @@
     <w:uiPriority w:val="62"/>
     <w:semiHidden/>
     <w:unhideWhenUsed/>
-    <w:rsid w:val="009616FD"/>
+    <w:rsid w:val="00C272FC"/>
     <w:pPr>
       <w:spacing w:line="240" w:lineRule="auto"/>
     </w:pPr>
@@ -4668,7 +4669,7 @@
     <w:uiPriority w:val="62"/>
     <w:semiHidden/>
     <w:unhideWhenUsed/>
-    <w:rsid w:val="009616FD"/>
+    <w:rsid w:val="00C272FC"/>
     <w:pPr>
       <w:spacing w:line="240" w:lineRule="auto"/>
     </w:pPr>
@@ -4793,7 +4794,7 @@
     <w:uiPriority w:val="62"/>
     <w:semiHidden/>
     <w:unhideWhenUsed/>
-    <w:rsid w:val="009616FD"/>
+    <w:rsid w:val="00C272FC"/>
     <w:pPr>
       <w:spacing w:line="240" w:lineRule="auto"/>
     </w:pPr>
@@ -4918,7 +4919,7 @@
     <w:uiPriority w:val="99"/>
     <w:semiHidden/>
     <w:unhideWhenUsed/>
-    <w:rsid w:val="009616FD"/>
+    <w:rsid w:val="00C272FC"/>
     <w:rPr>
       <w:color w:val="auto"/>
     </w:rPr>
@@ -4991,7 +4992,7 @@
     <w:uiPriority w:val="99"/>
     <w:semiHidden/>
     <w:unhideWhenUsed/>
-    <w:rsid w:val="009616FD"/>
+    <w:rsid w:val="00C272FC"/>
     <w:rPr>
       <w:color w:val="auto"/>
     </w:rPr>
@@ -5051,7 +5052,7 @@
     <w:uiPriority w:val="99"/>
     <w:semiHidden/>
     <w:unhideWhenUsed/>
-    <w:rsid w:val="009616FD"/>
+    <w:rsid w:val="00C272FC"/>
     <w:rPr>
       <w:color w:val="auto"/>
     </w:rPr>
@@ -5117,7 +5118,7 @@
     <w:uiPriority w:val="67"/>
     <w:semiHidden/>
     <w:unhideWhenUsed/>
-    <w:rsid w:val="009616FD"/>
+    <w:rsid w:val="00C272FC"/>
     <w:pPr>
       <w:spacing w:line="240" w:lineRule="auto"/>
     </w:pPr>
@@ -5185,7 +5186,7 @@
     <w:uiPriority w:val="67"/>
     <w:semiHidden/>
     <w:unhideWhenUsed/>
-    <w:rsid w:val="009616FD"/>
+    <w:rsid w:val="00C272FC"/>
     <w:pPr>
       <w:spacing w:line="240" w:lineRule="auto"/>
     </w:pPr>
@@ -5253,7 +5254,7 @@
     <w:uiPriority w:val="67"/>
     <w:semiHidden/>
     <w:unhideWhenUsed/>
-    <w:rsid w:val="009616FD"/>
+    <w:rsid w:val="00C272FC"/>
     <w:pPr>
       <w:spacing w:line="240" w:lineRule="auto"/>
     </w:pPr>
@@ -5321,7 +5322,7 @@
     <w:uiPriority w:val="67"/>
     <w:semiHidden/>
     <w:unhideWhenUsed/>
-    <w:rsid w:val="009616FD"/>
+    <w:rsid w:val="00C272FC"/>
     <w:pPr>
       <w:spacing w:line="240" w:lineRule="auto"/>
     </w:pPr>
@@ -5389,7 +5390,7 @@
     <w:uiPriority w:val="67"/>
     <w:semiHidden/>
     <w:unhideWhenUsed/>
-    <w:rsid w:val="009616FD"/>
+    <w:rsid w:val="00C272FC"/>
     <w:pPr>
       <w:spacing w:line="240" w:lineRule="auto"/>
     </w:pPr>
@@ -5457,7 +5458,7 @@
     <w:uiPriority w:val="67"/>
     <w:semiHidden/>
     <w:unhideWhenUsed/>
-    <w:rsid w:val="009616FD"/>
+    <w:rsid w:val="00C272FC"/>
     <w:pPr>
       <w:spacing w:line="240" w:lineRule="auto"/>
     </w:pPr>
@@ -5525,7 +5526,7 @@
     <w:uiPriority w:val="67"/>
     <w:semiHidden/>
     <w:unhideWhenUsed/>
-    <w:rsid w:val="009616FD"/>
+    <w:rsid w:val="00C272FC"/>
     <w:pPr>
       <w:spacing w:line="240" w:lineRule="auto"/>
     </w:pPr>
@@ -5593,7 +5594,7 @@
     <w:uiPriority w:val="68"/>
     <w:semiHidden/>
     <w:unhideWhenUsed/>
-    <w:rsid w:val="009616FD"/>
+    <w:rsid w:val="00C272FC"/>
     <w:pPr>
       <w:spacing w:line="240" w:lineRule="auto"/>
     </w:pPr>
@@ -5713,7 +5714,7 @@
     <w:uiPriority w:val="68"/>
     <w:semiHidden/>
     <w:unhideWhenUsed/>
-    <w:rsid w:val="009616FD"/>
+    <w:rsid w:val="00C272FC"/>
     <w:pPr>
       <w:spacing w:line="240" w:lineRule="auto"/>
     </w:pPr>
@@ -5833,7 +5834,7 @@
     <w:uiPriority w:val="68"/>
     <w:semiHidden/>
     <w:unhideWhenUsed/>
-    <w:rsid w:val="009616FD"/>
+    <w:rsid w:val="00C272FC"/>
     <w:pPr>
       <w:spacing w:line="240" w:lineRule="auto"/>
     </w:pPr>
@@ -5953,7 +5954,7 @@
     <w:uiPriority w:val="68"/>
     <w:semiHidden/>
     <w:unhideWhenUsed/>
-    <w:rsid w:val="009616FD"/>
+    <w:rsid w:val="00C272FC"/>
     <w:pPr>
       <w:spacing w:line="240" w:lineRule="auto"/>
     </w:pPr>
@@ -6073,7 +6074,7 @@
     <w:uiPriority w:val="68"/>
     <w:semiHidden/>
     <w:unhideWhenUsed/>
-    <w:rsid w:val="009616FD"/>
+    <w:rsid w:val="00C272FC"/>
     <w:pPr>
       <w:spacing w:line="240" w:lineRule="auto"/>
     </w:pPr>
@@ -6193,7 +6194,7 @@
     <w:uiPriority w:val="68"/>
     <w:semiHidden/>
     <w:unhideWhenUsed/>
-    <w:rsid w:val="009616FD"/>
+    <w:rsid w:val="00C272FC"/>
     <w:pPr>
       <w:spacing w:line="240" w:lineRule="auto"/>
     </w:pPr>
@@ -6313,7 +6314,7 @@
     <w:uiPriority w:val="68"/>
     <w:semiHidden/>
     <w:unhideWhenUsed/>
-    <w:rsid w:val="009616FD"/>
+    <w:rsid w:val="00C272FC"/>
     <w:pPr>
       <w:spacing w:line="240" w:lineRule="auto"/>
     </w:pPr>
@@ -6433,7 +6434,7 @@
     <w:uiPriority w:val="69"/>
     <w:semiHidden/>
     <w:unhideWhenUsed/>
-    <w:rsid w:val="009616FD"/>
+    <w:rsid w:val="00C272FC"/>
     <w:pPr>
       <w:spacing w:line="240" w:lineRule="auto"/>
     </w:pPr>
@@ -6569,7 +6570,7 @@
     <w:uiPriority w:val="69"/>
     <w:semiHidden/>
     <w:unhideWhenUsed/>
-    <w:rsid w:val="009616FD"/>
+    <w:rsid w:val="00C272FC"/>
     <w:pPr>
       <w:spacing w:line="240" w:lineRule="auto"/>
     </w:pPr>
@@ -6705,7 +6706,7 @@
     <w:uiPriority w:val="69"/>
     <w:semiHidden/>
     <w:unhideWhenUsed/>
-    <w:rsid w:val="009616FD"/>
+    <w:rsid w:val="00C272FC"/>
     <w:pPr>
       <w:spacing w:line="240" w:lineRule="auto"/>
     </w:pPr>
@@ -6841,7 +6842,7 @@
     <w:uiPriority w:val="69"/>
     <w:semiHidden/>
     <w:unhideWhenUsed/>
-    <w:rsid w:val="009616FD"/>
+    <w:rsid w:val="00C272FC"/>
     <w:pPr>
       <w:spacing w:line="240" w:lineRule="auto"/>
     </w:pPr>
@@ -6977,7 +6978,7 @@
     <w:uiPriority w:val="69"/>
     <w:semiHidden/>
     <w:unhideWhenUsed/>
-    <w:rsid w:val="009616FD"/>
+    <w:rsid w:val="00C272FC"/>
     <w:pPr>
       <w:spacing w:line="240" w:lineRule="auto"/>
     </w:pPr>
@@ -7113,7 +7114,7 @@
     <w:uiPriority w:val="69"/>
     <w:semiHidden/>
     <w:unhideWhenUsed/>
-    <w:rsid w:val="009616FD"/>
+    <w:rsid w:val="00C272FC"/>
     <w:pPr>
       <w:spacing w:line="240" w:lineRule="auto"/>
     </w:pPr>
@@ -7249,7 +7250,7 @@
     <w:uiPriority w:val="69"/>
     <w:semiHidden/>
     <w:unhideWhenUsed/>
-    <w:rsid w:val="009616FD"/>
+    <w:rsid w:val="00C272FC"/>
     <w:pPr>
       <w:spacing w:line="240" w:lineRule="auto"/>
     </w:pPr>
@@ -7385,7 +7386,7 @@
     <w:uiPriority w:val="73"/>
     <w:semiHidden/>
     <w:unhideWhenUsed/>
-    <w:rsid w:val="009616FD"/>
+    <w:rsid w:val="00C272FC"/>
     <w:pPr>
       <w:spacing w:line="240" w:lineRule="auto"/>
     </w:pPr>
@@ -7460,7 +7461,7 @@
     <w:uiPriority w:val="73"/>
     <w:semiHidden/>
     <w:unhideWhenUsed/>
-    <w:rsid w:val="009616FD"/>
+    <w:rsid w:val="00C272FC"/>
     <w:pPr>
       <w:spacing w:line="240" w:lineRule="auto"/>
     </w:pPr>
@@ -7535,7 +7536,7 @@
     <w:uiPriority w:val="73"/>
     <w:semiHidden/>
     <w:unhideWhenUsed/>
-    <w:rsid w:val="009616FD"/>
+    <w:rsid w:val="00C272FC"/>
     <w:pPr>
       <w:spacing w:line="240" w:lineRule="auto"/>
     </w:pPr>
@@ -7610,7 +7611,7 @@
     <w:uiPriority w:val="73"/>
     <w:semiHidden/>
     <w:unhideWhenUsed/>
-    <w:rsid w:val="009616FD"/>
+    <w:rsid w:val="00C272FC"/>
     <w:pPr>
       <w:spacing w:line="240" w:lineRule="auto"/>
     </w:pPr>
@@ -7685,7 +7686,7 @@
     <w:uiPriority w:val="73"/>
     <w:semiHidden/>
     <w:unhideWhenUsed/>
-    <w:rsid w:val="009616FD"/>
+    <w:rsid w:val="00C272FC"/>
     <w:pPr>
       <w:spacing w:line="240" w:lineRule="auto"/>
     </w:pPr>
@@ -7760,7 +7761,7 @@
     <w:uiPriority w:val="73"/>
     <w:semiHidden/>
     <w:unhideWhenUsed/>
-    <w:rsid w:val="009616FD"/>
+    <w:rsid w:val="00C272FC"/>
     <w:pPr>
       <w:spacing w:line="240" w:lineRule="auto"/>
     </w:pPr>
@@ -7835,7 +7836,7 @@
     <w:uiPriority w:val="73"/>
     <w:semiHidden/>
     <w:unhideWhenUsed/>
-    <w:rsid w:val="009616FD"/>
+    <w:rsid w:val="00C272FC"/>
     <w:pPr>
       <w:spacing w:line="240" w:lineRule="auto"/>
     </w:pPr>
@@ -7910,7 +7911,7 @@
     <w:uiPriority w:val="99"/>
     <w:semiHidden/>
     <w:unhideWhenUsed/>
-    <w:rsid w:val="009616FD"/>
+    <w:rsid w:val="00C272FC"/>
     <w:rPr>
       <w:rFonts w:ascii="Montserrat" w:hAnsi="Montserrat"/>
       <w:i/>
@@ -7925,7 +7926,7 @@
     <w:semiHidden/>
     <w:unhideWhenUsed/>
     <w:qFormat/>
-    <w:rsid w:val="009616FD"/>
+    <w:rsid w:val="00C272FC"/>
     <w:pPr>
       <w:spacing w:after="200" w:line="240" w:lineRule="auto"/>
     </w:pPr>
@@ -7944,7 +7945,7 @@
     <w:uiPriority w:val="99"/>
     <w:semiHidden/>
     <w:unhideWhenUsed/>
-    <w:rsid w:val="009616FD"/>
+    <w:rsid w:val="00C272FC"/>
     <w:pPr>
       <w:spacing w:line="240" w:lineRule="auto"/>
     </w:pPr>
@@ -7959,7 +7960,7 @@
     <w:link w:val="DireccinHTML"/>
     <w:uiPriority w:val="99"/>
     <w:semiHidden/>
-    <w:rsid w:val="009616FD"/>
+    <w:rsid w:val="00C272FC"/>
     <w:rPr>
       <w:rFonts w:ascii="Montserrat" w:hAnsi="Montserrat"/>
       <w:i/>
@@ -7972,7 +7973,7 @@
     <w:uiPriority w:val="99"/>
     <w:semiHidden/>
     <w:unhideWhenUsed/>
-    <w:rsid w:val="009616FD"/>
+    <w:rsid w:val="00C272FC"/>
     <w:pPr>
       <w:framePr w:w="7920" w:h="1980" w:hRule="exact" w:hSpace="141" w:wrap="auto" w:hAnchor="page" w:xAlign="center" w:yAlign="bottom"/>
       <w:spacing w:line="240" w:lineRule="auto"/>
@@ -7990,7 +7991,7 @@
     <w:uiPriority w:val="99"/>
     <w:semiHidden/>
     <w:unhideWhenUsed/>
-    <w:rsid w:val="009616FD"/>
+    <w:rsid w:val="00C272FC"/>
     <w:rPr>
       <w:rFonts w:ascii="Consolas" w:hAnsi="Consolas"/>
       <w:sz w:val="24"/>
@@ -8004,7 +8005,7 @@
     <w:uiPriority w:val="99"/>
     <w:semiHidden/>
     <w:unhideWhenUsed/>
-    <w:rsid w:val="009616FD"/>
+    <w:rsid w:val="00C272FC"/>
     <w:pPr>
       <w:spacing w:before="120"/>
     </w:pPr>
@@ -8023,7 +8024,7 @@
     <w:uiPriority w:val="99"/>
     <w:semiHidden/>
     <w:unhideWhenUsed/>
-    <w:rsid w:val="009616FD"/>
+    <w:rsid w:val="00C272FC"/>
     <w:pPr>
       <w:pBdr>
         <w:top w:val="single" w:sz="6" w:space="1" w:color="auto"/>
@@ -8047,7 +8048,7 @@
     <w:link w:val="Encabezadodemensaje"/>
     <w:uiPriority w:val="99"/>
     <w:semiHidden/>
-    <w:rsid w:val="009616FD"/>
+    <w:rsid w:val="00C272FC"/>
     <w:rPr>
       <w:rFonts w:asciiTheme="majorHAnsi" w:eastAsiaTheme="majorEastAsia" w:hAnsiTheme="majorHAnsi" w:cstheme="majorBidi"/>
       <w:sz w:val="24"/>
@@ -8063,7 +8064,7 @@
     <w:uiPriority w:val="99"/>
     <w:semiHidden/>
     <w:unhideWhenUsed/>
-    <w:rsid w:val="009616FD"/>
+    <w:rsid w:val="00C272FC"/>
     <w:pPr>
       <w:spacing w:line="240" w:lineRule="auto"/>
     </w:pPr>
@@ -8074,7 +8075,7 @@
     <w:link w:val="Encabezadodenota"/>
     <w:uiPriority w:val="99"/>
     <w:semiHidden/>
-    <w:rsid w:val="009616FD"/>
+    <w:rsid w:val="00C272FC"/>
     <w:rPr>
       <w:rFonts w:ascii="Montserrat" w:hAnsi="Montserrat"/>
     </w:rPr>
@@ -8084,7 +8085,7 @@
     <w:basedOn w:val="Fuentedeprrafopredeter"/>
     <w:uiPriority w:val="20"/>
     <w:qFormat/>
-    <w:rsid w:val="009616FD"/>
+    <w:rsid w:val="00C272FC"/>
     <w:rPr>
       <w:rFonts w:ascii="Montserrat" w:hAnsi="Montserrat"/>
       <w:i/>
@@ -8096,7 +8097,7 @@
     <w:basedOn w:val="Fuentedeprrafopredeter"/>
     <w:uiPriority w:val="21"/>
     <w:qFormat/>
-    <w:rsid w:val="009616FD"/>
+    <w:rsid w:val="00C272FC"/>
     <w:rPr>
       <w:rFonts w:ascii="Montserrat" w:hAnsi="Montserrat"/>
       <w:i/>
@@ -8109,7 +8110,7 @@
     <w:basedOn w:val="Fuentedeprrafopredeter"/>
     <w:uiPriority w:val="19"/>
     <w:qFormat/>
-    <w:rsid w:val="009616FD"/>
+    <w:rsid w:val="00C272FC"/>
     <w:rPr>
       <w:rFonts w:ascii="Montserrat" w:hAnsi="Montserrat"/>
       <w:i/>
@@ -8125,7 +8126,7 @@
     <w:uiPriority w:val="99"/>
     <w:semiHidden/>
     <w:unhideWhenUsed/>
-    <w:rsid w:val="009616FD"/>
+    <w:rsid w:val="00C272FC"/>
   </w:style>
   <w:style w:type="character" w:customStyle="1" w:styleId="FechaCar">
     <w:name w:val="Fecha Car"/>
@@ -8133,7 +8134,7 @@
     <w:link w:val="Fecha"/>
     <w:uiPriority w:val="99"/>
     <w:semiHidden/>
-    <w:rsid w:val="009616FD"/>
+    <w:rsid w:val="00C272FC"/>
     <w:rPr>
       <w:rFonts w:ascii="Montserrat" w:hAnsi="Montserrat"/>
     </w:rPr>
@@ -8145,7 +8146,7 @@
     <w:uiPriority w:val="99"/>
     <w:semiHidden/>
     <w:unhideWhenUsed/>
-    <w:rsid w:val="009616FD"/>
+    <w:rsid w:val="00C272FC"/>
     <w:pPr>
       <w:spacing w:line="240" w:lineRule="auto"/>
       <w:ind w:left="4252"/>
@@ -8157,7 +8158,7 @@
     <w:link w:val="Firma"/>
     <w:uiPriority w:val="99"/>
     <w:semiHidden/>
-    <w:rsid w:val="009616FD"/>
+    <w:rsid w:val="00C272FC"/>
     <w:rPr>
       <w:rFonts w:ascii="Montserrat" w:hAnsi="Montserrat"/>
     </w:rPr>
@@ -8169,7 +8170,7 @@
     <w:uiPriority w:val="99"/>
     <w:semiHidden/>
     <w:unhideWhenUsed/>
-    <w:rsid w:val="009616FD"/>
+    <w:rsid w:val="00C272FC"/>
     <w:pPr>
       <w:spacing w:line="240" w:lineRule="auto"/>
     </w:pPr>
@@ -8180,7 +8181,7 @@
     <w:link w:val="Firmadecorreoelectrnico"/>
     <w:uiPriority w:val="99"/>
     <w:semiHidden/>
-    <w:rsid w:val="009616FD"/>
+    <w:rsid w:val="00C272FC"/>
     <w:rPr>
       <w:rFonts w:ascii="Montserrat" w:hAnsi="Montserrat"/>
     </w:rPr>
@@ -8191,7 +8192,7 @@
     <w:uiPriority w:val="99"/>
     <w:semiHidden/>
     <w:unhideWhenUsed/>
-    <w:rsid w:val="009616FD"/>
+    <w:rsid w:val="00C272FC"/>
     <w:rPr>
       <w:rFonts w:ascii="Montserrat" w:hAnsi="Montserrat"/>
       <w:color w:val="2B579A"/>
@@ -8204,7 +8205,7 @@
     <w:uiPriority w:val="99"/>
     <w:semiHidden/>
     <w:unhideWhenUsed/>
-    <w:rsid w:val="009616FD"/>
+    <w:rsid w:val="00C272FC"/>
     <w:rPr>
       <w:rFonts w:ascii="Montserrat" w:hAnsi="Montserrat"/>
       <w:color w:val="0000FF" w:themeColor="hyperlink"/>
@@ -8217,7 +8218,7 @@
     <w:uiPriority w:val="99"/>
     <w:semiHidden/>
     <w:unhideWhenUsed/>
-    <w:rsid w:val="009616FD"/>
+    <w:rsid w:val="00C272FC"/>
     <w:rPr>
       <w:rFonts w:ascii="Montserrat" w:hAnsi="Montserrat"/>
       <w:u w:val="dotted"/>
@@ -8229,7 +8230,7 @@
     <w:uiPriority w:val="99"/>
     <w:semiHidden/>
     <w:unhideWhenUsed/>
-    <w:rsid w:val="009616FD"/>
+    <w:rsid w:val="00C272FC"/>
     <w:rPr>
       <w:rFonts w:ascii="Montserrat" w:hAnsi="Montserrat"/>
       <w:color w:val="800080" w:themeColor="followedHyperlink"/>
@@ -8243,7 +8244,7 @@
     <w:uiPriority w:val="99"/>
     <w:semiHidden/>
     <w:unhideWhenUsed/>
-    <w:rsid w:val="009616FD"/>
+    <w:rsid w:val="00C272FC"/>
     <w:pPr>
       <w:spacing w:line="240" w:lineRule="auto"/>
     </w:pPr>
@@ -8259,7 +8260,7 @@
     <w:link w:val="HTMLconformatoprevio"/>
     <w:uiPriority w:val="99"/>
     <w:semiHidden/>
-    <w:rsid w:val="009616FD"/>
+    <w:rsid w:val="00C272FC"/>
     <w:rPr>
       <w:rFonts w:ascii="Consolas" w:hAnsi="Consolas"/>
       <w:sz w:val="20"/>
@@ -8274,7 +8275,7 @@
     <w:uiPriority w:val="99"/>
     <w:semiHidden/>
     <w:unhideWhenUsed/>
-    <w:rsid w:val="009616FD"/>
+    <w:rsid w:val="00C272FC"/>
     <w:pPr>
       <w:spacing w:line="240" w:lineRule="auto"/>
       <w:ind w:left="220" w:hanging="220"/>
@@ -8288,7 +8289,7 @@
     <w:uiPriority w:val="99"/>
     <w:semiHidden/>
     <w:unhideWhenUsed/>
-    <w:rsid w:val="009616FD"/>
+    <w:rsid w:val="00C272FC"/>
     <w:pPr>
       <w:spacing w:line="240" w:lineRule="auto"/>
       <w:ind w:left="440" w:hanging="220"/>
@@ -8302,7 +8303,7 @@
     <w:uiPriority w:val="99"/>
     <w:semiHidden/>
     <w:unhideWhenUsed/>
-    <w:rsid w:val="009616FD"/>
+    <w:rsid w:val="00C272FC"/>
     <w:pPr>
       <w:spacing w:line="240" w:lineRule="auto"/>
       <w:ind w:left="660" w:hanging="220"/>
@@ -8316,7 +8317,7 @@
     <w:uiPriority w:val="99"/>
     <w:semiHidden/>
     <w:unhideWhenUsed/>
-    <w:rsid w:val="009616FD"/>
+    <w:rsid w:val="00C272FC"/>
     <w:pPr>
       <w:spacing w:line="240" w:lineRule="auto"/>
       <w:ind w:left="880" w:hanging="220"/>
@@ -8330,7 +8331,7 @@
     <w:uiPriority w:val="99"/>
     <w:semiHidden/>
     <w:unhideWhenUsed/>
-    <w:rsid w:val="009616FD"/>
+    <w:rsid w:val="00C272FC"/>
     <w:pPr>
       <w:spacing w:line="240" w:lineRule="auto"/>
       <w:ind w:left="1100" w:hanging="220"/>
@@ -8344,7 +8345,7 @@
     <w:uiPriority w:val="99"/>
     <w:semiHidden/>
     <w:unhideWhenUsed/>
-    <w:rsid w:val="009616FD"/>
+    <w:rsid w:val="00C272FC"/>
     <w:pPr>
       <w:spacing w:line="240" w:lineRule="auto"/>
       <w:ind w:left="1320" w:hanging="220"/>
@@ -8358,7 +8359,7 @@
     <w:uiPriority w:val="99"/>
     <w:semiHidden/>
     <w:unhideWhenUsed/>
-    <w:rsid w:val="009616FD"/>
+    <w:rsid w:val="00C272FC"/>
     <w:pPr>
       <w:spacing w:line="240" w:lineRule="auto"/>
       <w:ind w:left="1540" w:hanging="220"/>
@@ -8372,7 +8373,7 @@
     <w:uiPriority w:val="99"/>
     <w:semiHidden/>
     <w:unhideWhenUsed/>
-    <w:rsid w:val="009616FD"/>
+    <w:rsid w:val="00C272FC"/>
     <w:pPr>
       <w:spacing w:line="240" w:lineRule="auto"/>
       <w:ind w:left="1760" w:hanging="220"/>
@@ -8386,7 +8387,7 @@
     <w:uiPriority w:val="99"/>
     <w:semiHidden/>
     <w:unhideWhenUsed/>
-    <w:rsid w:val="009616FD"/>
+    <w:rsid w:val="00C272FC"/>
     <w:pPr>
       <w:spacing w:line="240" w:lineRule="auto"/>
       <w:ind w:left="1980" w:hanging="220"/>
@@ -8398,7 +8399,7 @@
     <w:uiPriority w:val="99"/>
     <w:semiHidden/>
     <w:unhideWhenUsed/>
-    <w:rsid w:val="009616FD"/>
+    <w:rsid w:val="00C272FC"/>
     <w:pPr>
       <w:ind w:left="283" w:hanging="283"/>
       <w:contextualSpacing/>
@@ -8410,7 +8411,7 @@
     <w:uiPriority w:val="99"/>
     <w:semiHidden/>
     <w:unhideWhenUsed/>
-    <w:rsid w:val="009616FD"/>
+    <w:rsid w:val="00C272FC"/>
     <w:pPr>
       <w:ind w:left="566" w:hanging="283"/>
       <w:contextualSpacing/>
@@ -8422,7 +8423,7 @@
     <w:uiPriority w:val="99"/>
     <w:semiHidden/>
     <w:unhideWhenUsed/>
-    <w:rsid w:val="009616FD"/>
+    <w:rsid w:val="00C272FC"/>
     <w:pPr>
       <w:ind w:left="849" w:hanging="283"/>
       <w:contextualSpacing/>
@@ -8434,7 +8435,7 @@
     <w:uiPriority w:val="99"/>
     <w:semiHidden/>
     <w:unhideWhenUsed/>
-    <w:rsid w:val="009616FD"/>
+    <w:rsid w:val="00C272FC"/>
     <w:pPr>
       <w:ind w:left="1132" w:hanging="283"/>
       <w:contextualSpacing/>
@@ -8446,7 +8447,7 @@
     <w:uiPriority w:val="99"/>
     <w:semiHidden/>
     <w:unhideWhenUsed/>
-    <w:rsid w:val="009616FD"/>
+    <w:rsid w:val="00C272FC"/>
     <w:pPr>
       <w:ind w:left="1415" w:hanging="283"/>
       <w:contextualSpacing/>
@@ -8458,7 +8459,7 @@
     <w:uiPriority w:val="61"/>
     <w:semiHidden/>
     <w:unhideWhenUsed/>
-    <w:rsid w:val="009616FD"/>
+    <w:rsid w:val="00C272FC"/>
     <w:pPr>
       <w:spacing w:line="240" w:lineRule="auto"/>
     </w:pPr>
@@ -8545,7 +8546,7 @@
     <w:uiPriority w:val="61"/>
     <w:semiHidden/>
     <w:unhideWhenUsed/>
-    <w:rsid w:val="009616FD"/>
+    <w:rsid w:val="00C272FC"/>
     <w:pPr>
       <w:spacing w:line="240" w:lineRule="auto"/>
     </w:pPr>
@@ -8632,7 +8633,7 @@
     <w:uiPriority w:val="61"/>
     <w:semiHidden/>
     <w:unhideWhenUsed/>
-    <w:rsid w:val="009616FD"/>
+    <w:rsid w:val="00C272FC"/>
     <w:pPr>
       <w:spacing w:line="240" w:lineRule="auto"/>
     </w:pPr>
@@ -8719,7 +8720,7 @@
     <w:uiPriority w:val="61"/>
     <w:semiHidden/>
     <w:unhideWhenUsed/>
-    <w:rsid w:val="009616FD"/>
+    <w:rsid w:val="00C272FC"/>
     <w:pPr>
       <w:spacing w:line="240" w:lineRule="auto"/>
     </w:pPr>
@@ -8806,7 +8807,7 @@
     <w:uiPriority w:val="61"/>
     <w:semiHidden/>
     <w:unhideWhenUsed/>
-    <w:rsid w:val="009616FD"/>
+    <w:rsid w:val="00C272FC"/>
     <w:pPr>
       <w:spacing w:line="240" w:lineRule="auto"/>
     </w:pPr>
@@ -8893,7 +8894,7 @@
     <w:uiPriority w:val="61"/>
     <w:semiHidden/>
     <w:unhideWhenUsed/>
-    <w:rsid w:val="009616FD"/>
+    <w:rsid w:val="00C272FC"/>
     <w:pPr>
       <w:spacing w:line="240" w:lineRule="auto"/>
     </w:pPr>
@@ -8980,7 +8981,7 @@
     <w:uiPriority w:val="61"/>
     <w:semiHidden/>
     <w:unhideWhenUsed/>
-    <w:rsid w:val="009616FD"/>
+    <w:rsid w:val="00C272FC"/>
     <w:pPr>
       <w:spacing w:line="240" w:lineRule="auto"/>
     </w:pPr>
@@ -9067,7 +9068,7 @@
     <w:uiPriority w:val="99"/>
     <w:semiHidden/>
     <w:unhideWhenUsed/>
-    <w:rsid w:val="009616FD"/>
+    <w:rsid w:val="00C272FC"/>
     <w:pPr>
       <w:numPr>
         <w:numId w:val="6"/>
@@ -9081,7 +9082,7 @@
     <w:uiPriority w:val="99"/>
     <w:semiHidden/>
     <w:unhideWhenUsed/>
-    <w:rsid w:val="009616FD"/>
+    <w:rsid w:val="00C272FC"/>
     <w:pPr>
       <w:numPr>
         <w:numId w:val="7"/>
@@ -9095,7 +9096,7 @@
     <w:uiPriority w:val="99"/>
     <w:semiHidden/>
     <w:unhideWhenUsed/>
-    <w:rsid w:val="009616FD"/>
+    <w:rsid w:val="00C272FC"/>
     <w:pPr>
       <w:numPr>
         <w:numId w:val="8"/>
@@ -9109,7 +9110,7 @@
     <w:uiPriority w:val="99"/>
     <w:semiHidden/>
     <w:unhideWhenUsed/>
-    <w:rsid w:val="009616FD"/>
+    <w:rsid w:val="00C272FC"/>
     <w:pPr>
       <w:numPr>
         <w:numId w:val="9"/>
@@ -9123,7 +9124,7 @@
     <w:uiPriority w:val="99"/>
     <w:semiHidden/>
     <w:unhideWhenUsed/>
-    <w:rsid w:val="009616FD"/>
+    <w:rsid w:val="00C272FC"/>
     <w:pPr>
       <w:numPr>
         <w:numId w:val="10"/>
@@ -9137,7 +9138,7 @@
     <w:uiPriority w:val="99"/>
     <w:semiHidden/>
     <w:unhideWhenUsed/>
-    <w:rsid w:val="009616FD"/>
+    <w:rsid w:val="00C272FC"/>
     <w:pPr>
       <w:numPr>
         <w:numId w:val="11"/>
@@ -9151,7 +9152,7 @@
     <w:uiPriority w:val="99"/>
     <w:semiHidden/>
     <w:unhideWhenUsed/>
-    <w:rsid w:val="009616FD"/>
+    <w:rsid w:val="00C272FC"/>
     <w:pPr>
       <w:numPr>
         <w:numId w:val="12"/>
@@ -9165,7 +9166,7 @@
     <w:uiPriority w:val="99"/>
     <w:semiHidden/>
     <w:unhideWhenUsed/>
-    <w:rsid w:val="009616FD"/>
+    <w:rsid w:val="00C272FC"/>
     <w:pPr>
       <w:numPr>
         <w:numId w:val="13"/>
@@ -9179,7 +9180,7 @@
     <w:uiPriority w:val="99"/>
     <w:semiHidden/>
     <w:unhideWhenUsed/>
-    <w:rsid w:val="009616FD"/>
+    <w:rsid w:val="00C272FC"/>
     <w:pPr>
       <w:numPr>
         <w:numId w:val="14"/>
@@ -9193,7 +9194,7 @@
     <w:uiPriority w:val="99"/>
     <w:semiHidden/>
     <w:unhideWhenUsed/>
-    <w:rsid w:val="009616FD"/>
+    <w:rsid w:val="00C272FC"/>
     <w:pPr>
       <w:numPr>
         <w:numId w:val="15"/>
@@ -9207,7 +9208,7 @@
     <w:uiPriority w:val="65"/>
     <w:semiHidden/>
     <w:unhideWhenUsed/>
-    <w:rsid w:val="009616FD"/>
+    <w:rsid w:val="00C272FC"/>
     <w:pPr>
       <w:spacing w:line="240" w:lineRule="auto"/>
     </w:pPr>
@@ -9286,7 +9287,7 @@
     <w:uiPriority w:val="65"/>
     <w:semiHidden/>
     <w:unhideWhenUsed/>
-    <w:rsid w:val="009616FD"/>
+    <w:rsid w:val="00C272FC"/>
     <w:pPr>
       <w:spacing w:line="240" w:lineRule="auto"/>
     </w:pPr>
@@ -9365,7 +9366,7 @@
     <w:uiPriority w:val="65"/>
     <w:semiHidden/>
     <w:unhideWhenUsed/>
-    <w:rsid w:val="009616FD"/>
+    <w:rsid w:val="00C272FC"/>
     <w:pPr>
       <w:spacing w:line="240" w:lineRule="auto"/>
     </w:pPr>
@@ -9444,7 +9445,7 @@
     <w:uiPriority w:val="65"/>
     <w:semiHidden/>
     <w:unhideWhenUsed/>
-    <w:rsid w:val="009616FD"/>
+    <w:rsid w:val="00C272FC"/>
     <w:pPr>
       <w:spacing w:line="240" w:lineRule="auto"/>
     </w:pPr>
@@ -9523,7 +9524,7 @@
     <w:uiPriority w:val="65"/>
     <w:semiHidden/>
     <w:unhideWhenUsed/>
-    <w:rsid w:val="009616FD"/>
+    <w:rsid w:val="00C272FC"/>
     <w:pPr>
       <w:spacing w:line="240" w:lineRule="auto"/>
     </w:pPr>
@@ -9602,7 +9603,7 @@
     <w:uiPriority w:val="65"/>
     <w:semiHidden/>
     <w:unhideWhenUsed/>
-    <w:rsid w:val="009616FD"/>
+    <w:rsid w:val="00C272FC"/>
     <w:pPr>
       <w:spacing w:line="240" w:lineRule="auto"/>
     </w:pPr>
@@ -9681,7 +9682,7 @@
     <w:uiPriority w:val="65"/>
     <w:semiHidden/>
     <w:unhideWhenUsed/>
-    <w:rsid w:val="009616FD"/>
+    <w:rsid w:val="00C272FC"/>
     <w:pPr>
       <w:spacing w:line="240" w:lineRule="auto"/>
     </w:pPr>
@@ -9760,7 +9761,7 @@
     <w:uiPriority w:val="66"/>
     <w:semiHidden/>
     <w:unhideWhenUsed/>
-    <w:rsid w:val="009616FD"/>
+    <w:rsid w:val="00C272FC"/>
     <w:pPr>
       <w:spacing w:line="240" w:lineRule="auto"/>
     </w:pPr>
@@ -9883,7 +9884,7 @@
     <w:uiPriority w:val="66"/>
     <w:semiHidden/>
     <w:unhideWhenUsed/>
-    <w:rsid w:val="009616FD"/>
+    <w:rsid w:val="00C272FC"/>
     <w:pPr>
       <w:spacing w:line="240" w:lineRule="auto"/>
     </w:pPr>
@@ -10006,7 +10007,7 @@
     <w:uiPriority w:val="66"/>
     <w:semiHidden/>
     <w:unhideWhenUsed/>
-    <w:rsid w:val="009616FD"/>
+    <w:rsid w:val="00C272FC"/>
     <w:pPr>
       <w:spacing w:line="240" w:lineRule="auto"/>
     </w:pPr>
@@ -10129,7 +10130,7 @@
     <w:uiPriority w:val="66"/>
     <w:semiHidden/>
     <w:unhideWhenUsed/>
-    <w:rsid w:val="009616FD"/>
+    <w:rsid w:val="00C272FC"/>
     <w:pPr>
       <w:spacing w:line="240" w:lineRule="auto"/>
     </w:pPr>
@@ -10252,7 +10253,7 @@
     <w:uiPriority w:val="66"/>
     <w:semiHidden/>
     <w:unhideWhenUsed/>
-    <w:rsid w:val="009616FD"/>
+    <w:rsid w:val="00C272FC"/>
     <w:pPr>
       <w:spacing w:line="240" w:lineRule="auto"/>
     </w:pPr>
@@ -10375,7 +10376,7 @@
     <w:uiPriority w:val="66"/>
     <w:semiHidden/>
     <w:unhideWhenUsed/>
-    <w:rsid w:val="009616FD"/>
+    <w:rsid w:val="00C272FC"/>
     <w:pPr>
       <w:spacing w:line="240" w:lineRule="auto"/>
     </w:pPr>
@@ -10498,7 +10499,7 @@
     <w:uiPriority w:val="66"/>
     <w:semiHidden/>
     <w:unhideWhenUsed/>
-    <w:rsid w:val="009616FD"/>
+    <w:rsid w:val="00C272FC"/>
     <w:pPr>
       <w:spacing w:line="240" w:lineRule="auto"/>
     </w:pPr>
@@ -10621,7 +10622,7 @@
     <w:uiPriority w:val="70"/>
     <w:semiHidden/>
     <w:unhideWhenUsed/>
-    <w:rsid w:val="009616FD"/>
+    <w:rsid w:val="00C272FC"/>
     <w:pPr>
       <w:spacing w:line="240" w:lineRule="auto"/>
     </w:pPr>
@@ -10730,7 +10731,7 @@
     <w:uiPriority w:val="70"/>
     <w:semiHidden/>
     <w:unhideWhenUsed/>
-    <w:rsid w:val="009616FD"/>
+    <w:rsid w:val="00C272FC"/>
     <w:pPr>
       <w:spacing w:line="240" w:lineRule="auto"/>
     </w:pPr>
@@ -10839,7 +10840,7 @@
     <w:uiPriority w:val="70"/>
     <w:semiHidden/>
     <w:unhideWhenUsed/>
-    <w:rsid w:val="009616FD"/>
+    <w:rsid w:val="00C272FC"/>
     <w:pPr>
       <w:spacing w:line="240" w:lineRule="auto"/>
     </w:pPr>
@@ -10948,7 +10949,7 @@
     <w:uiPriority w:val="70"/>
     <w:semiHidden/>
     <w:unhideWhenUsed/>
-    <w:rsid w:val="009616FD"/>
+    <w:rsid w:val="00C272FC"/>
     <w:pPr>
       <w:spacing w:line="240" w:lineRule="auto"/>
     </w:pPr>
@@ -11057,7 +11058,7 @@
     <w:uiPriority w:val="70"/>
     <w:semiHidden/>
     <w:unhideWhenUsed/>
-    <w:rsid w:val="009616FD"/>
+    <w:rsid w:val="00C272FC"/>
     <w:pPr>
       <w:spacing w:line="240" w:lineRule="auto"/>
     </w:pPr>
@@ -11166,7 +11167,7 @@
     <w:uiPriority w:val="70"/>
     <w:semiHidden/>
     <w:unhideWhenUsed/>
-    <w:rsid w:val="009616FD"/>
+    <w:rsid w:val="00C272FC"/>
     <w:pPr>
       <w:spacing w:line="240" w:lineRule="auto"/>
     </w:pPr>
@@ -11275,7 +11276,7 @@
     <w:uiPriority w:val="70"/>
     <w:semiHidden/>
     <w:unhideWhenUsed/>
-    <w:rsid w:val="009616FD"/>
+    <w:rsid w:val="00C272FC"/>
     <w:pPr>
       <w:spacing w:line="240" w:lineRule="auto"/>
     </w:pPr>
@@ -11384,7 +11385,7 @@
     <w:uiPriority w:val="72"/>
     <w:semiHidden/>
     <w:unhideWhenUsed/>
-    <w:rsid w:val="009616FD"/>
+    <w:rsid w:val="00C272FC"/>
     <w:pPr>
       <w:spacing w:line="240" w:lineRule="auto"/>
     </w:pPr>
@@ -11465,7 +11466,7 @@
     <w:uiPriority w:val="72"/>
     <w:semiHidden/>
     <w:unhideWhenUsed/>
-    <w:rsid w:val="009616FD"/>
+    <w:rsid w:val="00C272FC"/>
     <w:pPr>
       <w:spacing w:line="240" w:lineRule="auto"/>
     </w:pPr>
@@ -11546,7 +11547,7 @@
     <w:uiPriority w:val="72"/>
     <w:semiHidden/>
     <w:unhideWhenUsed/>
-    <w:rsid w:val="009616FD"/>
+    <w:rsid w:val="00C272FC"/>
     <w:pPr>
       <w:spacing w:line="240" w:lineRule="auto"/>
     </w:pPr>
@@ -11627,7 +11628,7 @@
     <w:uiPriority w:val="72"/>
     <w:semiHidden/>
     <w:unhideWhenUsed/>
-    <w:rsid w:val="009616FD"/>
+    <w:rsid w:val="00C272FC"/>
     <w:pPr>
       <w:spacing w:line="240" w:lineRule="auto"/>
     </w:pPr>
@@ -11708,7 +11709,7 @@
     <w:uiPriority w:val="72"/>
     <w:semiHidden/>
     <w:unhideWhenUsed/>
-    <w:rsid w:val="009616FD"/>
+    <w:rsid w:val="00C272FC"/>
     <w:pPr>
       <w:spacing w:line="240" w:lineRule="auto"/>
     </w:pPr>
@@ -11789,7 +11790,7 @@
     <w:uiPriority w:val="72"/>
     <w:semiHidden/>
     <w:unhideWhenUsed/>
-    <w:rsid w:val="009616FD"/>
+    <w:rsid w:val="00C272FC"/>
     <w:pPr>
       <w:spacing w:line="240" w:lineRule="auto"/>
     </w:pPr>
@@ -11870,7 +11871,7 @@
     <w:uiPriority w:val="72"/>
     <w:semiHidden/>
     <w:unhideWhenUsed/>
-    <w:rsid w:val="009616FD"/>
+    <w:rsid w:val="00C272FC"/>
     <w:pPr>
       <w:spacing w:line="240" w:lineRule="auto"/>
     </w:pPr>
@@ -11952,7 +11953,7 @@
     <w:uiPriority w:val="99"/>
     <w:semiHidden/>
     <w:unhideWhenUsed/>
-    <w:rsid w:val="009616FD"/>
+    <w:rsid w:val="00C272FC"/>
     <w:pPr>
       <w:spacing w:line="240" w:lineRule="auto"/>
     </w:pPr>
@@ -11968,7 +11969,7 @@
     <w:link w:val="Mapadeldocumento"/>
     <w:uiPriority w:val="99"/>
     <w:semiHidden/>
-    <w:rsid w:val="009616FD"/>
+    <w:rsid w:val="00C272FC"/>
     <w:rPr>
       <w:rFonts w:ascii="Segoe UI" w:hAnsi="Segoe UI" w:cs="Segoe UI"/>
       <w:sz w:val="16"/>
@@ -11981,7 +11982,7 @@
     <w:uiPriority w:val="99"/>
     <w:semiHidden/>
     <w:unhideWhenUsed/>
-    <w:rsid w:val="009616FD"/>
+    <w:rsid w:val="00C272FC"/>
     <w:rPr>
       <w:rFonts w:ascii="Consolas" w:hAnsi="Consolas"/>
       <w:sz w:val="20"/>
@@ -11994,7 +11995,7 @@
     <w:uiPriority w:val="99"/>
     <w:semiHidden/>
     <w:unhideWhenUsed/>
-    <w:rsid w:val="009616FD"/>
+    <w:rsid w:val="00C272FC"/>
     <w:rPr>
       <w:rFonts w:ascii="Montserrat" w:hAnsi="Montserrat"/>
       <w:color w:val="605E5C"/>
@@ -12007,7 +12008,7 @@
     <w:uiPriority w:val="99"/>
     <w:semiHidden/>
     <w:unhideWhenUsed/>
-    <w:rsid w:val="009616FD"/>
+    <w:rsid w:val="00C272FC"/>
     <w:rPr>
       <w:rFonts w:ascii="Montserrat" w:hAnsi="Montserrat"/>
       <w:color w:val="2B579A"/>
@@ -12020,7 +12021,7 @@
     <w:uiPriority w:val="99"/>
     <w:semiHidden/>
     <w:unhideWhenUsed/>
-    <w:rsid w:val="009616FD"/>
+    <w:rsid w:val="00C272FC"/>
     <w:rPr>
       <w:rFonts w:ascii="Times New Roman" w:hAnsi="Times New Roman" w:cs="Times New Roman"/>
       <w:sz w:val="24"/>
@@ -12033,7 +12034,7 @@
     <w:uiPriority w:val="99"/>
     <w:semiHidden/>
     <w:unhideWhenUsed/>
-    <w:rsid w:val="009616FD"/>
+    <w:rsid w:val="00C272FC"/>
     <w:rPr>
       <w:rFonts w:ascii="Montserrat" w:hAnsi="Montserrat"/>
     </w:rPr>
@@ -12044,7 +12045,7 @@
     <w:uiPriority w:val="99"/>
     <w:semiHidden/>
     <w:unhideWhenUsed/>
-    <w:rsid w:val="009616FD"/>
+    <w:rsid w:val="00C272FC"/>
     <w:rPr>
       <w:rFonts w:ascii="Montserrat" w:hAnsi="Montserrat"/>
     </w:rPr>
@@ -12055,7 +12056,7 @@
     <w:uiPriority w:val="99"/>
     <w:semiHidden/>
     <w:unhideWhenUsed/>
-    <w:rsid w:val="009616FD"/>
+    <w:rsid w:val="00C272FC"/>
     <w:rPr>
       <w:rFonts w:ascii="Montserrat" w:hAnsi="Montserrat"/>
       <w:sz w:val="16"/>
@@ -12068,7 +12069,7 @@
     <w:uiPriority w:val="99"/>
     <w:semiHidden/>
     <w:unhideWhenUsed/>
-    <w:rsid w:val="009616FD"/>
+    <w:rsid w:val="00C272FC"/>
     <w:rPr>
       <w:rFonts w:ascii="Montserrat" w:hAnsi="Montserrat"/>
       <w:vertAlign w:val="superscript"/>
@@ -12080,7 +12081,7 @@
     <w:uiPriority w:val="99"/>
     <w:semiHidden/>
     <w:unhideWhenUsed/>
-    <w:rsid w:val="009616FD"/>
+    <w:rsid w:val="00C272FC"/>
     <w:rPr>
       <w:rFonts w:ascii="Montserrat" w:hAnsi="Montserrat"/>
       <w:vertAlign w:val="superscript"/>
@@ -12091,7 +12092,7 @@
     <w:basedOn w:val="Fuentedeprrafopredeter"/>
     <w:uiPriority w:val="32"/>
     <w:qFormat/>
-    <w:rsid w:val="009616FD"/>
+    <w:rsid w:val="00C272FC"/>
     <w:rPr>
       <w:rFonts w:ascii="Montserrat" w:hAnsi="Montserrat"/>
       <w:b/>
@@ -12106,7 +12107,7 @@
     <w:basedOn w:val="Fuentedeprrafopredeter"/>
     <w:uiPriority w:val="31"/>
     <w:qFormat/>
-    <w:rsid w:val="009616FD"/>
+    <w:rsid w:val="00C272FC"/>
     <w:rPr>
       <w:rFonts w:ascii="Montserrat" w:hAnsi="Montserrat"/>
       <w:smallCaps/>
@@ -12119,7 +12120,7 @@
     <w:uiPriority w:val="99"/>
     <w:semiHidden/>
     <w:unhideWhenUsed/>
-    <w:rsid w:val="009616FD"/>
+    <w:rsid w:val="00C272FC"/>
     <w:pPr>
       <w:spacing w:line="240" w:lineRule="auto"/>
     </w:pPr>
@@ -12137,7 +12138,7 @@
     <w:uiPriority w:val="99"/>
     <w:semiHidden/>
     <w:unhideWhenUsed/>
-    <w:rsid w:val="009616FD"/>
+    <w:rsid w:val="00C272FC"/>
   </w:style>
   <w:style w:type="character" w:customStyle="1" w:styleId="SaludoCar">
     <w:name w:val="Saludo Car"/>
@@ -12145,7 +12146,7 @@
     <w:link w:val="Saludo"/>
     <w:uiPriority w:val="99"/>
     <w:semiHidden/>
-    <w:rsid w:val="009616FD"/>
+    <w:rsid w:val="00C272FC"/>
     <w:rPr>
       <w:rFonts w:ascii="Montserrat" w:hAnsi="Montserrat"/>
     </w:rPr>
@@ -12157,7 +12158,7 @@
     <w:uiPriority w:val="99"/>
     <w:semiHidden/>
     <w:unhideWhenUsed/>
-    <w:rsid w:val="009616FD"/>
+    <w:rsid w:val="00C272FC"/>
     <w:pPr>
       <w:spacing w:after="120" w:line="480" w:lineRule="auto"/>
       <w:ind w:left="283"/>
@@ -12169,7 +12170,7 @@
     <w:link w:val="Sangra2detindependiente"/>
     <w:uiPriority w:val="99"/>
     <w:semiHidden/>
-    <w:rsid w:val="009616FD"/>
+    <w:rsid w:val="00C272FC"/>
     <w:rPr>
       <w:rFonts w:ascii="Montserrat" w:hAnsi="Montserrat"/>
     </w:rPr>
@@ -12181,7 +12182,7 @@
     <w:uiPriority w:val="99"/>
     <w:semiHidden/>
     <w:unhideWhenUsed/>
-    <w:rsid w:val="009616FD"/>
+    <w:rsid w:val="00C272FC"/>
     <w:pPr>
       <w:spacing w:after="120"/>
       <w:ind w:left="283"/>
@@ -12197,7 +12198,7 @@
     <w:link w:val="Sangra3detindependiente"/>
     <w:uiPriority w:val="99"/>
     <w:semiHidden/>
-    <w:rsid w:val="009616FD"/>
+    <w:rsid w:val="00C272FC"/>
     <w:rPr>
       <w:rFonts w:ascii="Montserrat" w:hAnsi="Montserrat"/>
       <w:sz w:val="16"/>
@@ -12211,7 +12212,7 @@
     <w:uiPriority w:val="99"/>
     <w:semiHidden/>
     <w:unhideWhenUsed/>
-    <w:rsid w:val="009616FD"/>
+    <w:rsid w:val="00C272FC"/>
     <w:pPr>
       <w:spacing w:after="120"/>
       <w:ind w:left="283"/>
@@ -12223,7 +12224,7 @@
     <w:link w:val="Sangradetextonormal"/>
     <w:uiPriority w:val="99"/>
     <w:semiHidden/>
-    <w:rsid w:val="009616FD"/>
+    <w:rsid w:val="00C272FC"/>
     <w:rPr>
       <w:rFonts w:ascii="Montserrat" w:hAnsi="Montserrat"/>
     </w:rPr>
@@ -12234,7 +12235,7 @@
     <w:uiPriority w:val="99"/>
     <w:semiHidden/>
     <w:unhideWhenUsed/>
-    <w:rsid w:val="009616FD"/>
+    <w:rsid w:val="00C272FC"/>
     <w:pPr>
       <w:ind w:left="708"/>
     </w:pPr>
@@ -12245,7 +12246,7 @@
     <w:uiPriority w:val="99"/>
     <w:semiHidden/>
     <w:unhideWhenUsed/>
-    <w:rsid w:val="009616FD"/>
+    <w:rsid w:val="00C272FC"/>
     <w:rPr>
       <w:rFonts w:ascii="Montserrat" w:hAnsi="Montserrat"/>
       <w:color w:val="0000FF"/>
@@ -12259,7 +12260,7 @@
     <w:uiPriority w:val="60"/>
     <w:semiHidden/>
     <w:unhideWhenUsed/>
-    <w:rsid w:val="009616FD"/>
+    <w:rsid w:val="00C272FC"/>
     <w:pPr>
       <w:spacing w:line="240" w:lineRule="auto"/>
     </w:pPr>
@@ -12357,7 +12358,7 @@
     <w:uiPriority w:val="60"/>
     <w:semiHidden/>
     <w:unhideWhenUsed/>
-    <w:rsid w:val="009616FD"/>
+    <w:rsid w:val="00C272FC"/>
     <w:pPr>
       <w:spacing w:line="240" w:lineRule="auto"/>
     </w:pPr>
@@ -12455,7 +12456,7 @@
     <w:uiPriority w:val="60"/>
     <w:semiHidden/>
     <w:unhideWhenUsed/>
-    <w:rsid w:val="009616FD"/>
+    <w:rsid w:val="00C272FC"/>
     <w:pPr>
       <w:spacing w:line="240" w:lineRule="auto"/>
     </w:pPr>
@@ -12553,7 +12554,7 @@
     <w:uiPriority w:val="60"/>
     <w:semiHidden/>
     <w:unhideWhenUsed/>
-    <w:rsid w:val="009616FD"/>
+    <w:rsid w:val="00C272FC"/>
     <w:pPr>
       <w:spacing w:line="240" w:lineRule="auto"/>
     </w:pPr>
@@ -12651,7 +12652,7 @@
     <w:uiPriority w:val="60"/>
     <w:semiHidden/>
     <w:unhideWhenUsed/>
-    <w:rsid w:val="009616FD"/>
+    <w:rsid w:val="00C272FC"/>
     <w:pPr>
       <w:spacing w:line="240" w:lineRule="auto"/>
     </w:pPr>
@@ -12749,7 +12750,7 @@
     <w:uiPriority w:val="60"/>
     <w:semiHidden/>
     <w:unhideWhenUsed/>
-    <w:rsid w:val="009616FD"/>
+    <w:rsid w:val="00C272FC"/>
     <w:pPr>
       <w:spacing w:line="240" w:lineRule="auto"/>
     </w:pPr>
@@ -12847,7 +12848,7 @@
     <w:uiPriority w:val="60"/>
     <w:semiHidden/>
     <w:unhideWhenUsed/>
-    <w:rsid w:val="009616FD"/>
+    <w:rsid w:val="00C272FC"/>
     <w:pPr>
       <w:spacing w:line="240" w:lineRule="auto"/>
     </w:pPr>
@@ -12945,7 +12946,7 @@
     <w:uiPriority w:val="63"/>
     <w:semiHidden/>
     <w:unhideWhenUsed/>
-    <w:rsid w:val="009616FD"/>
+    <w:rsid w:val="00C272FC"/>
     <w:pPr>
       <w:spacing w:line="240" w:lineRule="auto"/>
     </w:pPr>
@@ -13046,7 +13047,7 @@
     <w:uiPriority w:val="63"/>
     <w:semiHidden/>
     <w:unhideWhenUsed/>
-    <w:rsid w:val="009616FD"/>
+    <w:rsid w:val="00C272FC"/>
     <w:pPr>
       <w:spacing w:line="240" w:lineRule="auto"/>
     </w:pPr>
@@ -13147,7 +13148,7 @@
     <w:uiPriority w:val="63"/>
     <w:semiHidden/>
     <w:unhideWhenUsed/>
-    <w:rsid w:val="009616FD"/>
+    <w:rsid w:val="00C272FC"/>
     <w:pPr>
       <w:spacing w:line="240" w:lineRule="auto"/>
     </w:pPr>
@@ -13248,7 +13249,7 @@
     <w:uiPriority w:val="63"/>
     <w:semiHidden/>
     <w:unhideWhenUsed/>
-    <w:rsid w:val="009616FD"/>
+    <w:rsid w:val="00C272FC"/>
     <w:pPr>
       <w:spacing w:line="240" w:lineRule="auto"/>
     </w:pPr>
@@ -13349,7 +13350,7 @@
     <w:uiPriority w:val="63"/>
     <w:semiHidden/>
     <w:unhideWhenUsed/>
-    <w:rsid w:val="009616FD"/>
+    <w:rsid w:val="00C272FC"/>
     <w:pPr>
       <w:spacing w:line="240" w:lineRule="auto"/>
     </w:pPr>
@@ -13450,7 +13451,7 @@
     <w:uiPriority w:val="63"/>
     <w:semiHidden/>
     <w:unhideWhenUsed/>
-    <w:rsid w:val="009616FD"/>
+    <w:rsid w:val="00C272FC"/>
     <w:pPr>
       <w:spacing w:line="240" w:lineRule="auto"/>
     </w:pPr>
@@ -13551,7 +13552,7 @@
     <w:uiPriority w:val="63"/>
     <w:semiHidden/>
     <w:unhideWhenUsed/>
-    <w:rsid w:val="009616FD"/>
+    <w:rsid w:val="00C272FC"/>
     <w:pPr>
       <w:spacing w:line="240" w:lineRule="auto"/>
     </w:pPr>
@@ -13652,7 +13653,7 @@
     <w:uiPriority w:val="64"/>
     <w:semiHidden/>
     <w:unhideWhenUsed/>
-    <w:rsid w:val="009616FD"/>
+    <w:rsid w:val="00C272FC"/>
     <w:pPr>
       <w:spacing w:line="240" w:lineRule="auto"/>
     </w:pPr>
@@ -13796,7 +13797,7 @@
     <w:uiPriority w:val="64"/>
     <w:semiHidden/>
     <w:unhideWhenUsed/>
-    <w:rsid w:val="009616FD"/>
+    <w:rsid w:val="00C272FC"/>
     <w:pPr>
       <w:spacing w:line="240" w:lineRule="auto"/>
     </w:pPr>
@@ -13940,7 +13941,7 @@
     <w:uiPriority w:val="64"/>
     <w:semiHidden/>
     <w:unhideWhenUsed/>
-    <w:rsid w:val="009616FD"/>
+    <w:rsid w:val="00C272FC"/>
     <w:pPr>
       <w:spacing w:line="240" w:lineRule="auto"/>
     </w:pPr>
@@ -14084,7 +14085,7 @@
     <w:uiPriority w:val="64"/>
     <w:semiHidden/>
     <w:unhideWhenUsed/>
-    <w:rsid w:val="009616FD"/>
+    <w:rsid w:val="00C272FC"/>
     <w:pPr>
       <w:spacing w:line="240" w:lineRule="auto"/>
     </w:pPr>
@@ -14228,7 +14229,7 @@
     <w:uiPriority w:val="64"/>
     <w:semiHidden/>
     <w:unhideWhenUsed/>
-    <w:rsid w:val="009616FD"/>
+    <w:rsid w:val="00C272FC"/>
     <w:pPr>
       <w:spacing w:line="240" w:lineRule="auto"/>
     </w:pPr>
@@ -14372,7 +14373,7 @@
     <w:uiPriority w:val="64"/>
     <w:semiHidden/>
     <w:unhideWhenUsed/>
-    <w:rsid w:val="009616FD"/>
+    <w:rsid w:val="00C272FC"/>
     <w:pPr>
       <w:spacing w:line="240" w:lineRule="auto"/>
     </w:pPr>
@@ -14516,7 +14517,7 @@
     <w:uiPriority w:val="64"/>
     <w:semiHidden/>
     <w:unhideWhenUsed/>
-    <w:rsid w:val="009616FD"/>
+    <w:rsid w:val="00C272FC"/>
     <w:pPr>
       <w:spacing w:line="240" w:lineRule="auto"/>
     </w:pPr>
@@ -14660,7 +14661,7 @@
     <w:uiPriority w:val="71"/>
     <w:semiHidden/>
     <w:unhideWhenUsed/>
-    <w:rsid w:val="009616FD"/>
+    <w:rsid w:val="00C272FC"/>
     <w:pPr>
       <w:spacing w:line="240" w:lineRule="auto"/>
     </w:pPr>
@@ -14777,7 +14778,7 @@
     <w:uiPriority w:val="71"/>
     <w:semiHidden/>
     <w:unhideWhenUsed/>
-    <w:rsid w:val="009616FD"/>
+    <w:rsid w:val="00C272FC"/>
     <w:pPr>
       <w:spacing w:line="240" w:lineRule="auto"/>
     </w:pPr>
@@ -14894,7 +14895,7 @@
     <w:uiPriority w:val="71"/>
     <w:semiHidden/>
     <w:unhideWhenUsed/>
-    <w:rsid w:val="009616FD"/>
+    <w:rsid w:val="00C272FC"/>
     <w:pPr>
       <w:spacing w:line="240" w:lineRule="auto"/>
     </w:pPr>
@@ -15011,7 +15012,7 @@
     <w:uiPriority w:val="71"/>
     <w:semiHidden/>
     <w:unhideWhenUsed/>
-    <w:rsid w:val="009616FD"/>
+    <w:rsid w:val="00C272FC"/>
     <w:pPr>
       <w:spacing w:line="240" w:lineRule="auto"/>
     </w:pPr>
@@ -15118,7 +15119,7 @@
     <w:uiPriority w:val="71"/>
     <w:semiHidden/>
     <w:unhideWhenUsed/>
-    <w:rsid w:val="009616FD"/>
+    <w:rsid w:val="00C272FC"/>
     <w:pPr>
       <w:spacing w:line="240" w:lineRule="auto"/>
     </w:pPr>
@@ -15235,7 +15236,7 @@
     <w:uiPriority w:val="71"/>
     <w:semiHidden/>
     <w:unhideWhenUsed/>
-    <w:rsid w:val="009616FD"/>
+    <w:rsid w:val="00C272FC"/>
     <w:pPr>
       <w:spacing w:line="240" w:lineRule="auto"/>
     </w:pPr>
@@ -15352,7 +15353,7 @@
     <w:uiPriority w:val="71"/>
     <w:semiHidden/>
     <w:unhideWhenUsed/>
-    <w:rsid w:val="009616FD"/>
+    <w:rsid w:val="00C272FC"/>
     <w:pPr>
       <w:spacing w:line="240" w:lineRule="auto"/>
     </w:pPr>
@@ -15469,7 +15470,7 @@
     <w:uiPriority w:val="99"/>
     <w:semiHidden/>
     <w:unhideWhenUsed/>
-    <w:rsid w:val="009616FD"/>
+    <w:rsid w:val="00C272FC"/>
     <w:rPr>
       <w:color w:val="auto"/>
     </w:rPr>
@@ -15509,7 +15510,7 @@
     <w:uiPriority w:val="99"/>
     <w:semiHidden/>
     <w:unhideWhenUsed/>
-    <w:rsid w:val="009616FD"/>
+    <w:rsid w:val="00C272FC"/>
     <w:tblPr/>
     <w:tblStylePr w:type="firstRow">
       <w:rPr>
@@ -15603,7 +15604,7 @@
     <w:uiPriority w:val="99"/>
     <w:semiHidden/>
     <w:unhideWhenUsed/>
-    <w:rsid w:val="009616FD"/>
+    <w:rsid w:val="00C272FC"/>
     <w:rPr>
       <w:color w:val="auto"/>
     </w:rPr>
@@ -15640,7 +15641,7 @@
     <w:uiPriority w:val="99"/>
     <w:semiHidden/>
     <w:unhideWhenUsed/>
-    <w:rsid w:val="009616FD"/>
+    <w:rsid w:val="00C272FC"/>
     <w:rPr>
       <w:color w:val="auto"/>
     </w:rPr>
@@ -15725,7 +15726,7 @@
     <w:uiPriority w:val="99"/>
     <w:semiHidden/>
     <w:unhideWhenUsed/>
-    <w:rsid w:val="009616FD"/>
+    <w:rsid w:val="00C272FC"/>
     <w:rPr>
       <w:color w:val="auto"/>
     </w:rPr>
@@ -15818,7 +15819,7 @@
     <w:uiPriority w:val="99"/>
     <w:semiHidden/>
     <w:unhideWhenUsed/>
-    <w:rsid w:val="009616FD"/>
+    <w:rsid w:val="00C272FC"/>
     <w:rPr>
       <w:color w:val="000080"/>
     </w:rPr>
@@ -15886,7 +15887,7 @@
     <w:uiPriority w:val="99"/>
     <w:semiHidden/>
     <w:unhideWhenUsed/>
-    <w:rsid w:val="009616FD"/>
+    <w:rsid w:val="00C272FC"/>
     <w:rPr>
       <w:color w:val="auto"/>
     </w:rPr>
@@ -15978,7 +15979,7 @@
     <w:uiPriority w:val="99"/>
     <w:semiHidden/>
     <w:unhideWhenUsed/>
-    <w:rsid w:val="009616FD"/>
+    <w:rsid w:val="00C272FC"/>
     <w:rPr>
       <w:b/>
       <w:bCs/>
@@ -16097,7 +16098,7 @@
     <w:uiPriority w:val="99"/>
     <w:semiHidden/>
     <w:unhideWhenUsed/>
-    <w:rsid w:val="009616FD"/>
+    <w:rsid w:val="00C272FC"/>
     <w:rPr>
       <w:b/>
       <w:bCs/>
@@ -16210,7 +16211,7 @@
     <w:uiPriority w:val="99"/>
     <w:semiHidden/>
     <w:unhideWhenUsed/>
-    <w:rsid w:val="009616FD"/>
+    <w:rsid w:val="00C272FC"/>
     <w:rPr>
       <w:b/>
       <w:bCs/>
@@ -16317,7 +16318,7 @@
     <w:uiPriority w:val="99"/>
     <w:semiHidden/>
     <w:unhideWhenUsed/>
-    <w:rsid w:val="009616FD"/>
+    <w:rsid w:val="00C272FC"/>
     <w:rPr>
       <w:color w:val="auto"/>
     </w:rPr>
@@ -16388,7 +16389,7 @@
     <w:uiPriority w:val="99"/>
     <w:semiHidden/>
     <w:unhideWhenUsed/>
-    <w:rsid w:val="009616FD"/>
+    <w:rsid w:val="00C272FC"/>
     <w:rPr>
       <w:color w:val="auto"/>
     </w:rPr>
@@ -16477,7 +16478,7 @@
     <w:name w:val="Table Grid"/>
     <w:basedOn w:val="Tablanormal"/>
     <w:uiPriority w:val="39"/>
-    <w:rsid w:val="009616FD"/>
+    <w:rsid w:val="00C272FC"/>
     <w:pPr>
       <w:spacing w:line="240" w:lineRule="auto"/>
     </w:pPr>
@@ -16498,7 +16499,7 @@
     <w:uiPriority w:val="99"/>
     <w:semiHidden/>
     <w:unhideWhenUsed/>
-    <w:rsid w:val="009616FD"/>
+    <w:rsid w:val="00C272FC"/>
     <w:rPr>
       <w:color w:val="auto"/>
     </w:rPr>
@@ -16546,7 +16547,7 @@
     <w:name w:val="Grid Table 1 Light"/>
     <w:basedOn w:val="Tablanormal"/>
     <w:uiPriority w:val="46"/>
-    <w:rsid w:val="009616FD"/>
+    <w:rsid w:val="00C272FC"/>
     <w:pPr>
       <w:spacing w:line="240" w:lineRule="auto"/>
     </w:pPr>
@@ -16603,7 +16604,7 @@
     <w:name w:val="Grid Table 1 Light Accent 1"/>
     <w:basedOn w:val="Tablanormal"/>
     <w:uiPriority w:val="46"/>
-    <w:rsid w:val="009616FD"/>
+    <w:rsid w:val="00C272FC"/>
     <w:pPr>
       <w:spacing w:line="240" w:lineRule="auto"/>
     </w:pPr>
@@ -16660,7 +16661,7 @@
     <w:name w:val="Grid Table 1 Light Accent 3"/>
     <w:basedOn w:val="Tablanormal"/>
     <w:uiPriority w:val="46"/>
-    <w:rsid w:val="009616FD"/>
+    <w:rsid w:val="00C272FC"/>
     <w:pPr>
       <w:spacing w:line="240" w:lineRule="auto"/>
     </w:pPr>
@@ -16717,7 +16718,7 @@
     <w:name w:val="Grid Table 1 Light Accent 4"/>
     <w:basedOn w:val="Tablanormal"/>
     <w:uiPriority w:val="46"/>
-    <w:rsid w:val="009616FD"/>
+    <w:rsid w:val="00C272FC"/>
     <w:pPr>
       <w:spacing w:line="240" w:lineRule="auto"/>
     </w:pPr>
@@ -16774,7 +16775,7 @@
     <w:name w:val="Grid Table 1 Light Accent 5"/>
     <w:basedOn w:val="Tablanormal"/>
     <w:uiPriority w:val="46"/>
-    <w:rsid w:val="009616FD"/>
+    <w:rsid w:val="00C272FC"/>
     <w:pPr>
       <w:spacing w:line="240" w:lineRule="auto"/>
     </w:pPr>
@@ -16831,7 +16832,7 @@
     <w:name w:val="Grid Table 1 Light Accent 6"/>
     <w:basedOn w:val="Tablanormal"/>
     <w:uiPriority w:val="46"/>
-    <w:rsid w:val="009616FD"/>
+    <w:rsid w:val="00C272FC"/>
     <w:pPr>
       <w:spacing w:line="240" w:lineRule="auto"/>
     </w:pPr>
@@ -16888,7 +16889,7 @@
     <w:name w:val="Grid Table 1 Light Accent 2"/>
     <w:basedOn w:val="Tablanormal"/>
     <w:uiPriority w:val="46"/>
-    <w:rsid w:val="009616FD"/>
+    <w:rsid w:val="00C272FC"/>
     <w:pPr>
       <w:spacing w:line="240" w:lineRule="auto"/>
     </w:pPr>
@@ -16945,7 +16946,7 @@
     <w:name w:val="Grid Table 2 Accent 1"/>
     <w:basedOn w:val="Tablanormal"/>
     <w:uiPriority w:val="47"/>
-    <w:rsid w:val="009616FD"/>
+    <w:rsid w:val="00C272FC"/>
     <w:pPr>
       <w:spacing w:line="240" w:lineRule="auto"/>
     </w:pPr>
@@ -17020,7 +17021,7 @@
     <w:name w:val="Grid Table 2 Accent 2"/>
     <w:basedOn w:val="Tablanormal"/>
     <w:uiPriority w:val="47"/>
-    <w:rsid w:val="009616FD"/>
+    <w:rsid w:val="00C272FC"/>
     <w:pPr>
       <w:spacing w:line="240" w:lineRule="auto"/>
     </w:pPr>
@@ -17095,7 +17096,7 @@
     <w:name w:val="Grid Table 2 Accent 3"/>
     <w:basedOn w:val="Tablanormal"/>
     <w:uiPriority w:val="47"/>
-    <w:rsid w:val="009616FD"/>
+    <w:rsid w:val="00C272FC"/>
     <w:pPr>
       <w:spacing w:line="240" w:lineRule="auto"/>
     </w:pPr>
@@ -17170,7 +17171,7 @@
     <w:name w:val="Grid Table 2 Accent 4"/>
     <w:basedOn w:val="Tablanormal"/>
     <w:uiPriority w:val="47"/>
-    <w:rsid w:val="009616FD"/>
+    <w:rsid w:val="00C272FC"/>
     <w:pPr>
       <w:spacing w:line="240" w:lineRule="auto"/>
     </w:pPr>
@@ -17245,7 +17246,7 @@
     <w:name w:val="Grid Table 2 Accent 5"/>
     <w:basedOn w:val="Tablanormal"/>
     <w:uiPriority w:val="47"/>
-    <w:rsid w:val="009616FD"/>
+    <w:rsid w:val="00C272FC"/>
     <w:pPr>
       <w:spacing w:line="240" w:lineRule="auto"/>
     </w:pPr>
@@ -17320,7 +17321,7 @@
     <w:name w:val="Grid Table 2 Accent 6"/>
     <w:basedOn w:val="Tablanormal"/>
     <w:uiPriority w:val="47"/>
-    <w:rsid w:val="009616FD"/>
+    <w:rsid w:val="00C272FC"/>
     <w:pPr>
       <w:spacing w:line="240" w:lineRule="auto"/>
     </w:pPr>
@@ -17395,7 +17396,7 @@
     <w:name w:val="Grid Table 3 Accent 1"/>
     <w:basedOn w:val="Tablanormal"/>
     <w:uiPriority w:val="48"/>
-    <w:rsid w:val="009616FD"/>
+    <w:rsid w:val="00C272FC"/>
     <w:pPr>
       <w:spacing w:line="240" w:lineRule="auto"/>
     </w:pPr>
@@ -17531,7 +17532,7 @@
     <w:name w:val="Grid Table 3 Accent 2"/>
     <w:basedOn w:val="Tablanormal"/>
     <w:uiPriority w:val="48"/>
-    <w:rsid w:val="009616FD"/>
+    <w:rsid w:val="00C272FC"/>
     <w:pPr>
       <w:spacing w:line="240" w:lineRule="auto"/>
     </w:pPr>
@@ -17667,7 +17668,7 @@
     <w:name w:val="Grid Table 3 Accent 3"/>
     <w:basedOn w:val="Tablanormal"/>
     <w:uiPriority w:val="48"/>
-    <w:rsid w:val="009616FD"/>
+    <w:rsid w:val="00C272FC"/>
     <w:pPr>
       <w:spacing w:line="240" w:lineRule="auto"/>
     </w:pPr>
@@ -17803,7 +17804,7 @@
     <w:name w:val="Grid Table 3 Accent 4"/>
     <w:basedOn w:val="Tablanormal"/>
     <w:uiPriority w:val="48"/>
-    <w:rsid w:val="009616FD"/>
+    <w:rsid w:val="00C272FC"/>
     <w:pPr>
       <w:spacing w:line="240" w:lineRule="auto"/>
     </w:pPr>
@@ -17939,7 +17940,7 @@
     <w:name w:val="Grid Table 3 Accent 5"/>
     <w:basedOn w:val="Tablanormal"/>
     <w:uiPriority w:val="48"/>
-    <w:rsid w:val="009616FD"/>
+    <w:rsid w:val="00C272FC"/>
     <w:pPr>
       <w:spacing w:line="240" w:lineRule="auto"/>
     </w:pPr>
@@ -18075,7 +18076,7 @@
     <w:name w:val="Grid Table 3 Accent 6"/>
     <w:basedOn w:val="Tablanormal"/>
     <w:uiPriority w:val="48"/>
-    <w:rsid w:val="009616FD"/>
+    <w:rsid w:val="00C272FC"/>
     <w:pPr>
       <w:spacing w:line="240" w:lineRule="auto"/>
     </w:pPr>
@@ -18211,7 +18212,7 @@
     <w:name w:val="Grid Table 4 Accent 1"/>
     <w:basedOn w:val="Tablanormal"/>
     <w:uiPriority w:val="49"/>
-    <w:rsid w:val="009616FD"/>
+    <w:rsid w:val="00C272FC"/>
     <w:pPr>
       <w:spacing w:line="240" w:lineRule="auto"/>
     </w:pPr>
@@ -18287,7 +18288,7 @@
     <w:name w:val="Grid Table 4 Accent 2"/>
     <w:basedOn w:val="Tablanormal"/>
     <w:uiPriority w:val="49"/>
-    <w:rsid w:val="009616FD"/>
+    <w:rsid w:val="00C272FC"/>
     <w:pPr>
       <w:spacing w:line="240" w:lineRule="auto"/>
     </w:pPr>
@@ -18363,7 +18364,7 @@
     <w:name w:val="Grid Table 4 Accent 3"/>
     <w:basedOn w:val="Tablanormal"/>
     <w:uiPriority w:val="49"/>
-    <w:rsid w:val="009616FD"/>
+    <w:rsid w:val="00C272FC"/>
     <w:pPr>
       <w:spacing w:line="240" w:lineRule="auto"/>
     </w:pPr>
@@ -18439,7 +18440,7 @@
     <w:name w:val="Grid Table 4 Accent 4"/>
     <w:basedOn w:val="Tablanormal"/>
     <w:uiPriority w:val="49"/>
-    <w:rsid w:val="009616FD"/>
+    <w:rsid w:val="00C272FC"/>
     <w:pPr>
       <w:spacing w:line="240" w:lineRule="auto"/>
     </w:pPr>
@@ -18515,7 +18516,7 @@
     <w:name w:val="Grid Table 4 Accent 5"/>
     <w:basedOn w:val="Tablanormal"/>
     <w:uiPriority w:val="49"/>
-    <w:rsid w:val="009616FD"/>
+    <w:rsid w:val="00C272FC"/>
     <w:pPr>
       <w:spacing w:line="240" w:lineRule="auto"/>
     </w:pPr>
@@ -18591,7 +18592,7 @@
     <w:name w:val="Grid Table 4 Accent 6"/>
     <w:basedOn w:val="Tablanormal"/>
     <w:uiPriority w:val="49"/>
-    <w:rsid w:val="009616FD"/>
+    <w:rsid w:val="00C272FC"/>
     <w:pPr>
       <w:spacing w:line="240" w:lineRule="auto"/>
     </w:pPr>
@@ -18669,7 +18670,7 @@
     <w:uiPriority w:val="99"/>
     <w:semiHidden/>
     <w:unhideWhenUsed/>
-    <w:rsid w:val="009616FD"/>
+    <w:rsid w:val="00C272FC"/>
     <w:rPr>
       <w:color w:val="auto"/>
     </w:rPr>
@@ -18736,7 +18737,7 @@
     <w:name w:val="Grid Table 5 Dark"/>
     <w:basedOn w:val="Tablanormal"/>
     <w:uiPriority w:val="50"/>
-    <w:rsid w:val="009616FD"/>
+    <w:rsid w:val="00C272FC"/>
     <w:pPr>
       <w:spacing w:line="240" w:lineRule="auto"/>
     </w:pPr>
@@ -18842,7 +18843,7 @@
     <w:name w:val="Grid Table 5 Dark Accent 1"/>
     <w:basedOn w:val="Tablanormal"/>
     <w:uiPriority w:val="50"/>
-    <w:rsid w:val="009616FD"/>
+    <w:rsid w:val="00C272FC"/>
     <w:pPr>
       <w:spacing w:line="240" w:lineRule="auto"/>
     </w:pPr>
@@ -18948,7 +18949,7 @@
     <w:name w:val="Grid Table 5 Dark Accent 2"/>
     <w:basedOn w:val="Tablanormal"/>
     <w:uiPriority w:val="50"/>
-    <w:rsid w:val="009616FD"/>
+    <w:rsid w:val="00C272FC"/>
     <w:pPr>
       <w:spacing w:line="240" w:lineRule="auto"/>
     </w:pPr>
@@ -19054,7 +19055,7 @@
     <w:name w:val="Grid Table 5 Dark Accent 3"/>
     <w:basedOn w:val="Tablanormal"/>
     <w:uiPriority w:val="50"/>
-    <w:rsid w:val="009616FD"/>
+    <w:rsid w:val="00C272FC"/>
     <w:pPr>
       <w:spacing w:line="240" w:lineRule="auto"/>
     </w:pPr>
@@ -19160,7 +19161,7 @@
     <w:name w:val="Grid Table 5 Dark Accent 4"/>
     <w:basedOn w:val="Tablanormal"/>
     <w:uiPriority w:val="50"/>
-    <w:rsid w:val="009616FD"/>
+    <w:rsid w:val="00C272FC"/>
     <w:pPr>
       <w:spacing w:line="240" w:lineRule="auto"/>
     </w:pPr>
@@ -19266,7 +19267,7 @@
     <w:name w:val="Grid Table 5 Dark Accent 5"/>
     <w:basedOn w:val="Tablanormal"/>
     <w:uiPriority w:val="50"/>
-    <w:rsid w:val="009616FD"/>
+    <w:rsid w:val="00C272FC"/>
     <w:pPr>
       <w:spacing w:line="240" w:lineRule="auto"/>
     </w:pPr>
@@ -19372,7 +19373,7 @@
     <w:name w:val="Grid Table 5 Dark Accent 6"/>
     <w:basedOn w:val="Tablanormal"/>
     <w:uiPriority w:val="50"/>
-    <w:rsid w:val="009616FD"/>
+    <w:rsid w:val="00C272FC"/>
     <w:pPr>
       <w:spacing w:line="240" w:lineRule="auto"/>
     </w:pPr>
@@ -19480,7 +19481,7 @@
     <w:uiPriority w:val="99"/>
     <w:semiHidden/>
     <w:unhideWhenUsed/>
-    <w:rsid w:val="009616FD"/>
+    <w:rsid w:val="00C272FC"/>
     <w:rPr>
       <w:color w:val="auto"/>
     </w:rPr>
@@ -19550,7 +19551,7 @@
     <w:name w:val="Grid Table 6 Colorful"/>
     <w:basedOn w:val="Tablanormal"/>
     <w:uiPriority w:val="51"/>
-    <w:rsid w:val="009616FD"/>
+    <w:rsid w:val="00C272FC"/>
     <w:pPr>
       <w:spacing w:line="240" w:lineRule="auto"/>
     </w:pPr>
@@ -19622,7 +19623,7 @@
     <w:name w:val="Grid Table 6 Colorful Accent 1"/>
     <w:basedOn w:val="Tablanormal"/>
     <w:uiPriority w:val="51"/>
-    <w:rsid w:val="009616FD"/>
+    <w:rsid w:val="00C272FC"/>
     <w:pPr>
       <w:spacing w:line="240" w:lineRule="auto"/>
     </w:pPr>
@@ -19694,7 +19695,7 @@
     <w:name w:val="Grid Table 6 Colorful Accent 2"/>
     <w:basedOn w:val="Tablanormal"/>
     <w:uiPriority w:val="51"/>
-    <w:rsid w:val="009616FD"/>
+    <w:rsid w:val="00C272FC"/>
     <w:pPr>
       <w:spacing w:line="240" w:lineRule="auto"/>
     </w:pPr>
@@ -19766,7 +19767,7 @@
     <w:name w:val="Grid Table 6 Colorful Accent 3"/>
     <w:basedOn w:val="Tablanormal"/>
     <w:uiPriority w:val="51"/>
-    <w:rsid w:val="009616FD"/>
+    <w:rsid w:val="00C272FC"/>
     <w:pPr>
       <w:spacing w:line="240" w:lineRule="auto"/>
     </w:pPr>
@@ -19838,7 +19839,7 @@
     <w:name w:val="Grid Table 6 Colorful Accent 4"/>
     <w:basedOn w:val="Tablanormal"/>
     <w:uiPriority w:val="51"/>
-    <w:rsid w:val="009616FD"/>
+    <w:rsid w:val="00C272FC"/>
     <w:pPr>
       <w:spacing w:line="240" w:lineRule="auto"/>
     </w:pPr>
@@ -19910,7 +19911,7 @@
     <w:name w:val="Grid Table 6 Colorful Accent 5"/>
     <w:basedOn w:val="Tablanormal"/>
     <w:uiPriority w:val="51"/>
-    <w:rsid w:val="009616FD"/>
+    <w:rsid w:val="00C272FC"/>
     <w:pPr>
       <w:spacing w:line="240" w:lineRule="auto"/>
     </w:pPr>
@@ -19982,7 +19983,7 @@
     <w:name w:val="Grid Table 6 Colorful Accent 6"/>
     <w:basedOn w:val="Tablanormal"/>
     <w:uiPriority w:val="51"/>
-    <w:rsid w:val="009616FD"/>
+    <w:rsid w:val="00C272FC"/>
     <w:pPr>
       <w:spacing w:line="240" w:lineRule="auto"/>
     </w:pPr>
@@ -20056,7 +20057,7 @@
     <w:uiPriority w:val="99"/>
     <w:semiHidden/>
     <w:unhideWhenUsed/>
-    <w:rsid w:val="009616FD"/>
+    <w:rsid w:val="00C272FC"/>
     <w:rPr>
       <w:b/>
       <w:bCs/>
@@ -20143,7 +20144,7 @@
     <w:name w:val="Grid Table 7 Colorful"/>
     <w:basedOn w:val="Tablanormal"/>
     <w:uiPriority w:val="52"/>
-    <w:rsid w:val="009616FD"/>
+    <w:rsid w:val="00C272FC"/>
     <w:pPr>
       <w:spacing w:line="240" w:lineRule="auto"/>
     </w:pPr>
@@ -20282,7 +20283,7 @@
     <w:name w:val="Grid Table 7 Colorful Accent 1"/>
     <w:basedOn w:val="Tablanormal"/>
     <w:uiPriority w:val="52"/>
-    <w:rsid w:val="009616FD"/>
+    <w:rsid w:val="00C272FC"/>
     <w:pPr>
       <w:spacing w:line="240" w:lineRule="auto"/>
     </w:pPr>
@@ -20421,7 +20422,7 @@
     <w:name w:val="Grid Table 7 Colorful Accent 2"/>
     <w:basedOn w:val="Tablanormal"/>
     <w:uiPriority w:val="52"/>
-    <w:rsid w:val="009616FD"/>
+    <w:rsid w:val="00C272FC"/>
     <w:pPr>
       <w:spacing w:line="240" w:lineRule="auto"/>
     </w:pPr>
@@ -20560,7 +20561,7 @@
     <w:name w:val="Grid Table 7 Colorful Accent 3"/>
     <w:basedOn w:val="Tablanormal"/>
     <w:uiPriority w:val="52"/>
-    <w:rsid w:val="009616FD"/>
+    <w:rsid w:val="00C272FC"/>
     <w:pPr>
       <w:spacing w:line="240" w:lineRule="auto"/>
     </w:pPr>
@@ -20699,7 +20700,7 @@
     <w:name w:val="Grid Table 7 Colorful Accent 4"/>
     <w:basedOn w:val="Tablanormal"/>
     <w:uiPriority w:val="52"/>
-    <w:rsid w:val="009616FD"/>
+    <w:rsid w:val="00C272FC"/>
     <w:pPr>
       <w:spacing w:line="240" w:lineRule="auto"/>
     </w:pPr>
@@ -20838,7 +20839,7 @@
     <w:name w:val="Grid Table 7 Colorful Accent 5"/>
     <w:basedOn w:val="Tablanormal"/>
     <w:uiPriority w:val="52"/>
-    <w:rsid w:val="009616FD"/>
+    <w:rsid w:val="00C272FC"/>
     <w:pPr>
       <w:spacing w:line="240" w:lineRule="auto"/>
     </w:pPr>
@@ -20977,7 +20978,7 @@
     <w:name w:val="Grid Table 7 Colorful Accent 6"/>
     <w:basedOn w:val="Tablanormal"/>
     <w:uiPriority w:val="52"/>
-    <w:rsid w:val="009616FD"/>
+    <w:rsid w:val="00C272FC"/>
     <w:pPr>
       <w:spacing w:line="240" w:lineRule="auto"/>
     </w:pPr>
@@ -21118,7 +21119,7 @@
     <w:uiPriority w:val="99"/>
     <w:semiHidden/>
     <w:unhideWhenUsed/>
-    <w:rsid w:val="009616FD"/>
+    <w:rsid w:val="00C272FC"/>
     <w:rPr>
       <w:color w:val="auto"/>
     </w:rPr>
@@ -21183,7 +21184,7 @@
     <w:name w:val="Grid Table Light"/>
     <w:basedOn w:val="Tablanormal"/>
     <w:uiPriority w:val="40"/>
-    <w:rsid w:val="009616FD"/>
+    <w:rsid w:val="00C272FC"/>
     <w:pPr>
       <w:spacing w:line="240" w:lineRule="auto"/>
     </w:pPr>
@@ -21204,7 +21205,7 @@
     <w:uiPriority w:val="99"/>
     <w:semiHidden/>
     <w:unhideWhenUsed/>
-    <w:rsid w:val="009616FD"/>
+    <w:rsid w:val="00C272FC"/>
     <w:rPr>
       <w:color w:val="auto"/>
     </w:rPr>
@@ -21315,7 +21316,7 @@
     <w:uiPriority w:val="99"/>
     <w:semiHidden/>
     <w:unhideWhenUsed/>
-    <w:rsid w:val="009616FD"/>
+    <w:rsid w:val="00C272FC"/>
     <w:rPr>
       <w:color w:val="auto"/>
     </w:rPr>
@@ -21391,7 +21392,7 @@
     <w:uiPriority w:val="99"/>
     <w:semiHidden/>
     <w:unhideWhenUsed/>
-    <w:rsid w:val="009616FD"/>
+    <w:rsid w:val="00C272FC"/>
     <w:rPr>
       <w:color w:val="auto"/>
     </w:rPr>
@@ -21483,7 +21484,7 @@
     <w:uiPriority w:val="99"/>
     <w:semiHidden/>
     <w:unhideWhenUsed/>
-    <w:rsid w:val="009616FD"/>
+    <w:rsid w:val="00C272FC"/>
     <w:tblPr>
       <w:tblStyleRowBandSize w:val="1"/>
       <w:tblBorders>
@@ -21566,7 +21567,7 @@
     <w:uiPriority w:val="99"/>
     <w:semiHidden/>
     <w:unhideWhenUsed/>
-    <w:rsid w:val="009616FD"/>
+    <w:rsid w:val="00C272FC"/>
     <w:tblPr>
       <w:tblStyleRowBandSize w:val="2"/>
       <w:tblBorders>
@@ -21644,7 +21645,7 @@
     <w:uiPriority w:val="99"/>
     <w:semiHidden/>
     <w:unhideWhenUsed/>
-    <w:rsid w:val="009616FD"/>
+    <w:rsid w:val="00C272FC"/>
     <w:rPr>
       <w:color w:val="auto"/>
     </w:rPr>
@@ -21704,7 +21705,7 @@
     <w:uiPriority w:val="99"/>
     <w:semiHidden/>
     <w:unhideWhenUsed/>
-    <w:rsid w:val="009616FD"/>
+    <w:rsid w:val="00C272FC"/>
     <w:rPr>
       <w:color w:val="auto"/>
     </w:rPr>
@@ -21743,7 +21744,7 @@
     <w:uiPriority w:val="99"/>
     <w:semiHidden/>
     <w:unhideWhenUsed/>
-    <w:rsid w:val="009616FD"/>
+    <w:rsid w:val="00C272FC"/>
     <w:rPr>
       <w:color w:val="auto"/>
     </w:rPr>
@@ -21793,7 +21794,7 @@
     <w:uiPriority w:val="99"/>
     <w:semiHidden/>
     <w:unhideWhenUsed/>
-    <w:rsid w:val="009616FD"/>
+    <w:rsid w:val="00C272FC"/>
     <w:rPr>
       <w:color w:val="auto"/>
     </w:rPr>
@@ -21854,7 +21855,7 @@
     <w:uiPriority w:val="99"/>
     <w:semiHidden/>
     <w:unhideWhenUsed/>
-    <w:rsid w:val="009616FD"/>
+    <w:rsid w:val="00C272FC"/>
     <w:tblPr>
       <w:tblStyleRowBandSize w:val="1"/>
       <w:tblBorders>
@@ -21950,7 +21951,7 @@
     <w:uiPriority w:val="99"/>
     <w:semiHidden/>
     <w:unhideWhenUsed/>
-    <w:rsid w:val="009616FD"/>
+    <w:rsid w:val="00C272FC"/>
     <w:tblPr>
       <w:tblStyleRowBandSize w:val="1"/>
       <w:tblBorders>
@@ -22048,7 +22049,7 @@
     <w:uiPriority w:val="99"/>
     <w:semiHidden/>
     <w:unhideWhenUsed/>
-    <w:rsid w:val="009616FD"/>
+    <w:rsid w:val="00C272FC"/>
     <w:tblPr>
       <w:tblBorders>
         <w:top w:val="single" w:sz="4" w:space="0" w:color="auto"/>
@@ -22064,7 +22065,7 @@
     <w:name w:val="Grid Table 2"/>
     <w:basedOn w:val="Tablanormal"/>
     <w:uiPriority w:val="47"/>
-    <w:rsid w:val="009616FD"/>
+    <w:rsid w:val="00C272FC"/>
     <w:pPr>
       <w:spacing w:line="240" w:lineRule="auto"/>
     </w:pPr>
@@ -22139,7 +22140,7 @@
     <w:name w:val="Grid Table 3"/>
     <w:basedOn w:val="Tablanormal"/>
     <w:uiPriority w:val="48"/>
-    <w:rsid w:val="009616FD"/>
+    <w:rsid w:val="00C272FC"/>
     <w:pPr>
       <w:spacing w:line="240" w:lineRule="auto"/>
     </w:pPr>
@@ -22275,7 +22276,7 @@
     <w:name w:val="Grid Table 4"/>
     <w:basedOn w:val="Tablanormal"/>
     <w:uiPriority w:val="49"/>
-    <w:rsid w:val="009616FD"/>
+    <w:rsid w:val="00C272FC"/>
     <w:pPr>
       <w:spacing w:line="240" w:lineRule="auto"/>
     </w:pPr>
@@ -22354,13 +22355,13 @@
     <w:uiPriority w:val="99"/>
     <w:semiHidden/>
     <w:unhideWhenUsed/>
-    <w:rsid w:val="009616FD"/>
+    <w:rsid w:val="00C272FC"/>
   </w:style>
   <w:style w:type="table" w:styleId="Tabladelista1clara">
     <w:name w:val="List Table 1 Light"/>
     <w:basedOn w:val="Tablanormal"/>
     <w:uiPriority w:val="46"/>
-    <w:rsid w:val="009616FD"/>
+    <w:rsid w:val="00C272FC"/>
     <w:pPr>
       <w:spacing w:line="240" w:lineRule="auto"/>
     </w:pPr>
@@ -22421,7 +22422,7 @@
     <w:name w:val="List Table 1 Light Accent 1"/>
     <w:basedOn w:val="Tablanormal"/>
     <w:uiPriority w:val="46"/>
-    <w:rsid w:val="009616FD"/>
+    <w:rsid w:val="00C272FC"/>
     <w:pPr>
       <w:spacing w:line="240" w:lineRule="auto"/>
     </w:pPr>
@@ -22482,7 +22483,7 @@
     <w:name w:val="List Table 1 Light Accent 2"/>
     <w:basedOn w:val="Tablanormal"/>
     <w:uiPriority w:val="46"/>
-    <w:rsid w:val="009616FD"/>
+    <w:rsid w:val="00C272FC"/>
     <w:pPr>
       <w:spacing w:line="240" w:lineRule="auto"/>
     </w:pPr>
@@ -22543,7 +22544,7 @@
     <w:name w:val="List Table 1 Light Accent 3"/>
     <w:basedOn w:val="Tablanormal"/>
     <w:uiPriority w:val="46"/>
-    <w:rsid w:val="009616FD"/>
+    <w:rsid w:val="00C272FC"/>
     <w:pPr>
       <w:spacing w:line="240" w:lineRule="auto"/>
     </w:pPr>
@@ -22604,7 +22605,7 @@
     <w:name w:val="List Table 1 Light Accent 4"/>
     <w:basedOn w:val="Tablanormal"/>
     <w:uiPriority w:val="46"/>
-    <w:rsid w:val="009616FD"/>
+    <w:rsid w:val="00C272FC"/>
     <w:pPr>
       <w:spacing w:line="240" w:lineRule="auto"/>
     </w:pPr>
@@ -22665,7 +22666,7 @@
     <w:name w:val="List Table 1 Light Accent 5"/>
     <w:basedOn w:val="Tablanormal"/>
     <w:uiPriority w:val="46"/>
-    <w:rsid w:val="009616FD"/>
+    <w:rsid w:val="00C272FC"/>
     <w:pPr>
       <w:spacing w:line="240" w:lineRule="auto"/>
     </w:pPr>
@@ -22726,7 +22727,7 @@
     <w:name w:val="List Table 1 Light Accent 6"/>
     <w:basedOn w:val="Tablanormal"/>
     <w:uiPriority w:val="46"/>
-    <w:rsid w:val="009616FD"/>
+    <w:rsid w:val="00C272FC"/>
     <w:pPr>
       <w:spacing w:line="240" w:lineRule="auto"/>
     </w:pPr>
@@ -22787,7 +22788,7 @@
     <w:name w:val="List Table 2"/>
     <w:basedOn w:val="Tablanormal"/>
     <w:uiPriority w:val="47"/>
-    <w:rsid w:val="009616FD"/>
+    <w:rsid w:val="00C272FC"/>
     <w:pPr>
       <w:spacing w:line="240" w:lineRule="auto"/>
     </w:pPr>
@@ -22841,7 +22842,7 @@
     <w:name w:val="List Table 2 Accent 1"/>
     <w:basedOn w:val="Tablanormal"/>
     <w:uiPriority w:val="47"/>
-    <w:rsid w:val="009616FD"/>
+    <w:rsid w:val="00C272FC"/>
     <w:pPr>
       <w:spacing w:line="240" w:lineRule="auto"/>
     </w:pPr>
@@ -22895,7 +22896,7 @@
     <w:name w:val="List Table 2 Accent 2"/>
     <w:basedOn w:val="Tablanormal"/>
     <w:uiPriority w:val="47"/>
-    <w:rsid w:val="009616FD"/>
+    <w:rsid w:val="00C272FC"/>
     <w:pPr>
       <w:spacing w:line="240" w:lineRule="auto"/>
     </w:pPr>
@@ -22949,7 +22950,7 @@
     <w:name w:val="List Table 2 Accent 3"/>
     <w:basedOn w:val="Tablanormal"/>
     <w:uiPriority w:val="47"/>
-    <w:rsid w:val="009616FD"/>
+    <w:rsid w:val="00C272FC"/>
     <w:pPr>
       <w:spacing w:line="240" w:lineRule="auto"/>
     </w:pPr>
@@ -23003,7 +23004,7 @@
     <w:name w:val="List Table 2 Accent 4"/>
     <w:basedOn w:val="Tablanormal"/>
     <w:uiPriority w:val="47"/>
-    <w:rsid w:val="009616FD"/>
+    <w:rsid w:val="00C272FC"/>
     <w:pPr>
       <w:spacing w:line="240" w:lineRule="auto"/>
     </w:pPr>
@@ -23057,7 +23058,7 @@
     <w:name w:val="List Table 2 Accent 5"/>
     <w:basedOn w:val="Tablanormal"/>
     <w:uiPriority w:val="47"/>
-    <w:rsid w:val="009616FD"/>
+    <w:rsid w:val="00C272FC"/>
     <w:pPr>
       <w:spacing w:line="240" w:lineRule="auto"/>
     </w:pPr>
@@ -23111,7 +23112,7 @@
     <w:name w:val="List Table 2 Accent 6"/>
     <w:basedOn w:val="Tablanormal"/>
     <w:uiPriority w:val="47"/>
-    <w:rsid w:val="009616FD"/>
+    <w:rsid w:val="00C272FC"/>
     <w:pPr>
       <w:spacing w:line="240" w:lineRule="auto"/>
     </w:pPr>
@@ -23165,7 +23166,7 @@
     <w:name w:val="List Table 3"/>
     <w:basedOn w:val="Tablanormal"/>
     <w:uiPriority w:val="48"/>
-    <w:rsid w:val="009616FD"/>
+    <w:rsid w:val="00C272FC"/>
     <w:pPr>
       <w:spacing w:line="240" w:lineRule="auto"/>
     </w:pPr>
@@ -23289,7 +23290,7 @@
     <w:name w:val="List Table 3 Accent 1"/>
     <w:basedOn w:val="Tablanormal"/>
     <w:uiPriority w:val="48"/>
-    <w:rsid w:val="009616FD"/>
+    <w:rsid w:val="00C272FC"/>
     <w:pPr>
       <w:spacing w:line="240" w:lineRule="auto"/>
     </w:pPr>
@@ -23413,7 +23414,7 @@
     <w:name w:val="List Table 3 Accent 2"/>
     <w:basedOn w:val="Tablanormal"/>
     <w:uiPriority w:val="48"/>
-    <w:rsid w:val="009616FD"/>
+    <w:rsid w:val="00C272FC"/>
     <w:pPr>
       <w:spacing w:line="240" w:lineRule="auto"/>
     </w:pPr>
@@ -23537,7 +23538,7 @@
     <w:name w:val="List Table 3 Accent 3"/>
     <w:basedOn w:val="Tablanormal"/>
     <w:uiPriority w:val="48"/>
-    <w:rsid w:val="009616FD"/>
+    <w:rsid w:val="00C272FC"/>
     <w:pPr>
       <w:spacing w:line="240" w:lineRule="auto"/>
     </w:pPr>
@@ -23661,7 +23662,7 @@
     <w:name w:val="List Table 3 Accent 4"/>
     <w:basedOn w:val="Tablanormal"/>
     <w:uiPriority w:val="48"/>
-    <w:rsid w:val="009616FD"/>
+    <w:rsid w:val="00C272FC"/>
     <w:pPr>
       <w:spacing w:line="240" w:lineRule="auto"/>
     </w:pPr>
@@ -23785,7 +23786,7 @@
     <w:name w:val="List Table 3 Accent 5"/>
     <w:basedOn w:val="Tablanormal"/>
     <w:uiPriority w:val="48"/>
-    <w:rsid w:val="009616FD"/>
+    <w:rsid w:val="00C272FC"/>
     <w:pPr>
       <w:spacing w:line="240" w:lineRule="auto"/>
     </w:pPr>
@@ -23909,7 +23910,7 @@
     <w:name w:val="List Table 3 Accent 6"/>
     <w:basedOn w:val="Tablanormal"/>
     <w:uiPriority w:val="48"/>
-    <w:rsid w:val="009616FD"/>
+    <w:rsid w:val="00C272FC"/>
     <w:pPr>
       <w:spacing w:line="240" w:lineRule="auto"/>
     </w:pPr>
@@ -24033,7 +24034,7 @@
     <w:name w:val="List Table 4"/>
     <w:basedOn w:val="Tablanormal"/>
     <w:uiPriority w:val="49"/>
-    <w:rsid w:val="009616FD"/>
+    <w:rsid w:val="00C272FC"/>
     <w:pPr>
       <w:spacing w:line="240" w:lineRule="auto"/>
     </w:pPr>
@@ -24107,7 +24108,7 @@
     <w:name w:val="List Table 4 Accent 1"/>
     <w:basedOn w:val="Tablanormal"/>
     <w:uiPriority w:val="49"/>
-    <w:rsid w:val="009616FD"/>
+    <w:rsid w:val="00C272FC"/>
     <w:pPr>
       <w:spacing w:line="240" w:lineRule="auto"/>
     </w:pPr>
@@ -24181,7 +24182,7 @@
     <w:name w:val="List Table 4 Accent 2"/>
     <w:basedOn w:val="Tablanormal"/>
     <w:uiPriority w:val="49"/>
-    <w:rsid w:val="009616FD"/>
+    <w:rsid w:val="00C272FC"/>
     <w:pPr>
       <w:spacing w:line="240" w:lineRule="auto"/>
     </w:pPr>
@@ -24255,7 +24256,7 @@
     <w:name w:val="List Table 4 Accent 3"/>
     <w:basedOn w:val="Tablanormal"/>
     <w:uiPriority w:val="49"/>
-    <w:rsid w:val="009616FD"/>
+    <w:rsid w:val="00C272FC"/>
     <w:pPr>
       <w:spacing w:line="240" w:lineRule="auto"/>
     </w:pPr>
@@ -24329,7 +24330,7 @@
     <w:name w:val="List Table 4 Accent 4"/>
     <w:basedOn w:val="Tablanormal"/>
     <w:uiPriority w:val="49"/>
-    <w:rsid w:val="009616FD"/>
+    <w:rsid w:val="00C272FC"/>
     <w:pPr>
       <w:spacing w:line="240" w:lineRule="auto"/>
     </w:pPr>
@@ -24403,7 +24404,7 @@
     <w:name w:val="List Table 4 Accent 5"/>
     <w:basedOn w:val="Tablanormal"/>
     <w:uiPriority w:val="49"/>
-    <w:rsid w:val="009616FD"/>
+    <w:rsid w:val="00C272FC"/>
     <w:pPr>
       <w:spacing w:line="240" w:lineRule="auto"/>
     </w:pPr>
@@ -24477,7 +24478,7 @@
     <w:name w:val="List Table 4 Accent 6"/>
     <w:basedOn w:val="Tablanormal"/>
     <w:uiPriority w:val="49"/>
-    <w:rsid w:val="009616FD"/>
+    <w:rsid w:val="00C272FC"/>
     <w:pPr>
       <w:spacing w:line="240" w:lineRule="auto"/>
     </w:pPr>
@@ -24551,7 +24552,7 @@
     <w:name w:val="List Table 5 Dark"/>
     <w:basedOn w:val="Tablanormal"/>
     <w:uiPriority w:val="50"/>
-    <w:rsid w:val="009616FD"/>
+    <w:rsid w:val="00C272FC"/>
     <w:pPr>
       <w:spacing w:line="240" w:lineRule="auto"/>
     </w:pPr>
@@ -24685,7 +24686,7 @@
     <w:name w:val="List Table 5 Dark Accent 1"/>
     <w:basedOn w:val="Tablanormal"/>
     <w:uiPriority w:val="50"/>
-    <w:rsid w:val="009616FD"/>
+    <w:rsid w:val="00C272FC"/>
     <w:pPr>
       <w:spacing w:line="240" w:lineRule="auto"/>
     </w:pPr>
@@ -24819,7 +24820,7 @@
     <w:name w:val="List Table 5 Dark Accent 2"/>
     <w:basedOn w:val="Tablanormal"/>
     <w:uiPriority w:val="50"/>
-    <w:rsid w:val="009616FD"/>
+    <w:rsid w:val="00C272FC"/>
     <w:pPr>
       <w:spacing w:line="240" w:lineRule="auto"/>
     </w:pPr>
@@ -24953,7 +24954,7 @@
     <w:name w:val="List Table 5 Dark Accent 3"/>
     <w:basedOn w:val="Tablanormal"/>
     <w:uiPriority w:val="50"/>
-    <w:rsid w:val="009616FD"/>
+    <w:rsid w:val="00C272FC"/>
     <w:pPr>
       <w:spacing w:line="240" w:lineRule="auto"/>
     </w:pPr>
@@ -25087,7 +25088,7 @@
     <w:name w:val="List Table 5 Dark Accent 4"/>
     <w:basedOn w:val="Tablanormal"/>
     <w:uiPriority w:val="50"/>
-    <w:rsid w:val="009616FD"/>
+    <w:rsid w:val="00C272FC"/>
     <w:pPr>
       <w:spacing w:line="240" w:lineRule="auto"/>
     </w:pPr>
@@ -25221,7 +25222,7 @@
     <w:name w:val="List Table 5 Dark Accent 5"/>
     <w:basedOn w:val="Tablanormal"/>
     <w:uiPriority w:val="50"/>
-    <w:rsid w:val="009616FD"/>
+    <w:rsid w:val="00C272FC"/>
     <w:pPr>
       <w:spacing w:line="240" w:lineRule="auto"/>
     </w:pPr>
@@ -25355,7 +25356,7 @@
     <w:name w:val="List Table 5 Dark Accent 6"/>
     <w:basedOn w:val="Tablanormal"/>
     <w:uiPriority w:val="50"/>
-    <w:rsid w:val="009616FD"/>
+    <w:rsid w:val="00C272FC"/>
     <w:pPr>
       <w:spacing w:line="240" w:lineRule="auto"/>
     </w:pPr>
@@ -25489,7 +25490,7 @@
     <w:name w:val="List Table 6 Colorful"/>
     <w:basedOn w:val="Tablanormal"/>
     <w:uiPriority w:val="51"/>
-    <w:rsid w:val="009616FD"/>
+    <w:rsid w:val="00C272FC"/>
     <w:pPr>
       <w:spacing w:line="240" w:lineRule="auto"/>
     </w:pPr>
@@ -25557,7 +25558,7 @@
     <w:name w:val="List Table 6 Colorful Accent 1"/>
     <w:basedOn w:val="Tablanormal"/>
     <w:uiPriority w:val="51"/>
-    <w:rsid w:val="009616FD"/>
+    <w:rsid w:val="00C272FC"/>
     <w:pPr>
       <w:spacing w:line="240" w:lineRule="auto"/>
     </w:pPr>
@@ -25625,7 +25626,7 @@
     <w:name w:val="List Table 6 Colorful Accent 2"/>
     <w:basedOn w:val="Tablanormal"/>
     <w:uiPriority w:val="51"/>
-    <w:rsid w:val="009616FD"/>
+    <w:rsid w:val="00C272FC"/>
     <w:pPr>
       <w:spacing w:line="240" w:lineRule="auto"/>
     </w:pPr>
@@ -25693,7 +25694,7 @@
     <w:name w:val="List Table 6 Colorful Accent 3"/>
     <w:basedOn w:val="Tablanormal"/>
     <w:uiPriority w:val="51"/>
-    <w:rsid w:val="009616FD"/>
+    <w:rsid w:val="00C272FC"/>
     <w:pPr>
       <w:spacing w:line="240" w:lineRule="auto"/>
     </w:pPr>
@@ -25761,7 +25762,7 @@
     <w:name w:val="List Table 6 Colorful Accent 4"/>
     <w:basedOn w:val="Tablanormal"/>
     <w:uiPriority w:val="51"/>
-    <w:rsid w:val="009616FD"/>
+    <w:rsid w:val="00C272FC"/>
     <w:pPr>
       <w:spacing w:line="240" w:lineRule="auto"/>
     </w:pPr>
@@ -25829,7 +25830,7 @@
     <w:name w:val="List Table 6 Colorful Accent 5"/>
     <w:basedOn w:val="Tablanormal"/>
     <w:uiPriority w:val="51"/>
-    <w:rsid w:val="009616FD"/>
+    <w:rsid w:val="00C272FC"/>
     <w:pPr>
       <w:spacing w:line="240" w:lineRule="auto"/>
     </w:pPr>
@@ -25897,7 +25898,7 @@
     <w:name w:val="List Table 6 Colorful Accent 6"/>
     <w:basedOn w:val="Tablanormal"/>
     <w:uiPriority w:val="51"/>
-    <w:rsid w:val="009616FD"/>
+    <w:rsid w:val="00C272FC"/>
     <w:pPr>
       <w:spacing w:line="240" w:lineRule="auto"/>
     </w:pPr>
@@ -25965,7 +25966,7 @@
     <w:name w:val="List Table 7 Colorful"/>
     <w:basedOn w:val="Tablanormal"/>
     <w:uiPriority w:val="52"/>
-    <w:rsid w:val="009616FD"/>
+    <w:rsid w:val="00C272FC"/>
     <w:pPr>
       <w:spacing w:line="240" w:lineRule="auto"/>
     </w:pPr>
@@ -26088,7 +26089,7 @@
     <w:name w:val="List Table 7 Colorful Accent 1"/>
     <w:basedOn w:val="Tablanormal"/>
     <w:uiPriority w:val="52"/>
-    <w:rsid w:val="009616FD"/>
+    <w:rsid w:val="00C272FC"/>
     <w:pPr>
       <w:spacing w:line="240" w:lineRule="auto"/>
     </w:pPr>
@@ -26211,7 +26212,7 @@
     <w:name w:val="List Table 7 Colorful Accent 2"/>
     <w:basedOn w:val="Tablanormal"/>
     <w:uiPriority w:val="52"/>
-    <w:rsid w:val="009616FD"/>
+    <w:rsid w:val="00C272FC"/>
     <w:pPr>
       <w:spacing w:line="240" w:lineRule="auto"/>
     </w:pPr>
@@ -26334,7 +26335,7 @@
     <w:name w:val="List Table 7 Colorful Accent 3"/>
     <w:basedOn w:val="Tablanormal"/>
     <w:uiPriority w:val="52"/>
-    <w:rsid w:val="009616FD"/>
+    <w:rsid w:val="00C272FC"/>
     <w:pPr>
       <w:spacing w:line="240" w:lineRule="auto"/>
     </w:pPr>
@@ -26457,7 +26458,7 @@
     <w:name w:val="List Table 7 Colorful Accent 4"/>
     <w:basedOn w:val="Tablanormal"/>
     <w:uiPriority w:val="52"/>
-    <w:rsid w:val="009616FD"/>
+    <w:rsid w:val="00C272FC"/>
     <w:pPr>
       <w:spacing w:line="240" w:lineRule="auto"/>
     </w:pPr>
@@ -26580,7 +26581,7 @@
     <w:name w:val="List Table 7 Colorful Accent 5"/>
     <w:basedOn w:val="Tablanormal"/>
     <w:uiPriority w:val="52"/>
-    <w:rsid w:val="009616FD"/>
+    <w:rsid w:val="00C272FC"/>
     <w:pPr>
       <w:spacing w:line="240" w:lineRule="auto"/>
     </w:pPr>
@@ -26703,7 +26704,7 @@
     <w:name w:val="List Table 7 Colorful Accent 6"/>
     <w:basedOn w:val="Tablanormal"/>
     <w:uiPriority w:val="52"/>
-    <w:rsid w:val="009616FD"/>
+    <w:rsid w:val="00C272FC"/>
     <w:pPr>
       <w:spacing w:line="240" w:lineRule="auto"/>
     </w:pPr>
@@ -26828,7 +26829,7 @@
     <w:uiPriority w:val="99"/>
     <w:semiHidden/>
     <w:unhideWhenUsed/>
-    <w:rsid w:val="009616FD"/>
+    <w:rsid w:val="00C272FC"/>
     <w:rPr>
       <w:color w:val="auto"/>
     </w:rPr>
@@ -26865,7 +26866,7 @@
     <w:uiPriority w:val="99"/>
     <w:semiHidden/>
     <w:unhideWhenUsed/>
-    <w:rsid w:val="009616FD"/>
+    <w:rsid w:val="00C272FC"/>
     <w:tblPr>
       <w:tblStyleRowBandSize w:val="1"/>
       <w:tblBorders>
@@ -26919,7 +26920,7 @@
     <w:name w:val="Plain Table 1"/>
     <w:basedOn w:val="Tablanormal"/>
     <w:uiPriority w:val="41"/>
-    <w:rsid w:val="009616FD"/>
+    <w:rsid w:val="00C272FC"/>
     <w:pPr>
       <w:spacing w:line="240" w:lineRule="auto"/>
     </w:pPr>
@@ -26982,7 +26983,7 @@
     <w:name w:val="Plain Table 2"/>
     <w:basedOn w:val="Tablanormal"/>
     <w:uiPriority w:val="42"/>
-    <w:rsid w:val="009616FD"/>
+    <w:rsid w:val="00C272FC"/>
     <w:pPr>
       <w:spacing w:line="240" w:lineRule="auto"/>
     </w:pPr>
@@ -27062,7 +27063,7 @@
     <w:name w:val="Plain Table 3"/>
     <w:basedOn w:val="Tablanormal"/>
     <w:uiPriority w:val="43"/>
-    <w:rsid w:val="009616FD"/>
+    <w:rsid w:val="00C272FC"/>
     <w:pPr>
       <w:spacing w:line="240" w:lineRule="auto"/>
     </w:pPr>
@@ -27155,7 +27156,7 @@
     <w:name w:val="Plain Table 4"/>
     <w:basedOn w:val="Tablanormal"/>
     <w:uiPriority w:val="44"/>
-    <w:rsid w:val="009616FD"/>
+    <w:rsid w:val="00C272FC"/>
     <w:pPr>
       <w:spacing w:line="240" w:lineRule="auto"/>
     </w:pPr>
@@ -27204,7 +27205,7 @@
     <w:name w:val="Plain Table 5"/>
     <w:basedOn w:val="Tablanormal"/>
     <w:uiPriority w:val="45"/>
-    <w:rsid w:val="009616FD"/>
+    <w:rsid w:val="00C272FC"/>
     <w:pPr>
       <w:spacing w:line="240" w:lineRule="auto"/>
     </w:pPr>
@@ -27326,7 +27327,7 @@
     <w:uiPriority w:val="99"/>
     <w:semiHidden/>
     <w:unhideWhenUsed/>
-    <w:rsid w:val="009616FD"/>
+    <w:rsid w:val="00C272FC"/>
     <w:rPr>
       <w:color w:val="auto"/>
     </w:rPr>
@@ -27365,7 +27366,7 @@
     <w:uiPriority w:val="99"/>
     <w:semiHidden/>
     <w:unhideWhenUsed/>
-    <w:rsid w:val="009616FD"/>
+    <w:rsid w:val="00C272FC"/>
     <w:tblPr>
       <w:tblStyleRowBandSize w:val="1"/>
     </w:tblPr>
@@ -27455,7 +27456,7 @@
     <w:uiPriority w:val="99"/>
     <w:semiHidden/>
     <w:unhideWhenUsed/>
-    <w:rsid w:val="009616FD"/>
+    <w:rsid w:val="00C272FC"/>
     <w:tblPr>
       <w:tblBorders>
         <w:left w:val="single" w:sz="6" w:space="0" w:color="000000"/>
@@ -27537,7 +27538,7 @@
     <w:uiPriority w:val="99"/>
     <w:semiHidden/>
     <w:unhideWhenUsed/>
-    <w:rsid w:val="009616FD"/>
+    <w:rsid w:val="00C272FC"/>
     <w:rPr>
       <w:color w:val="FFFFFF"/>
     </w:rPr>
@@ -27617,7 +27618,7 @@
     <w:uiPriority w:val="99"/>
     <w:semiHidden/>
     <w:unhideWhenUsed/>
-    <w:rsid w:val="009616FD"/>
+    <w:rsid w:val="00C272FC"/>
     <w:rPr>
       <w:color w:val="auto"/>
     </w:rPr>
@@ -27694,7 +27695,7 @@
     <w:uiPriority w:val="99"/>
     <w:semiHidden/>
     <w:unhideWhenUsed/>
-    <w:rsid w:val="009616FD"/>
+    <w:rsid w:val="00C272FC"/>
     <w:rPr>
       <w:color w:val="auto"/>
     </w:rPr>
@@ -27755,7 +27756,7 @@
     <w:uiPriority w:val="99"/>
     <w:semiHidden/>
     <w:unhideWhenUsed/>
-    <w:rsid w:val="009616FD"/>
+    <w:rsid w:val="00C272FC"/>
     <w:rPr>
       <w:color w:val="auto"/>
     </w:rPr>
@@ -27795,7 +27796,7 @@
     <w:uiPriority w:val="99"/>
     <w:semiHidden/>
     <w:unhideWhenUsed/>
-    <w:rsid w:val="009616FD"/>
+    <w:rsid w:val="00C272FC"/>
     <w:rPr>
       <w:color w:val="auto"/>
     </w:rPr>
@@ -27835,7 +27836,7 @@
     <w:uiPriority w:val="99"/>
     <w:semiHidden/>
     <w:unhideWhenUsed/>
-    <w:rsid w:val="009616FD"/>
+    <w:rsid w:val="00C272FC"/>
     <w:rPr>
       <w:color w:val="auto"/>
     </w:rPr>
@@ -27877,7 +27878,7 @@
     <w:uiPriority w:val="39"/>
     <w:semiHidden/>
     <w:unhideWhenUsed/>
-    <w:rsid w:val="009616FD"/>
+    <w:rsid w:val="00C272FC"/>
     <w:pPr>
       <w:spacing w:after="100"/>
     </w:pPr>
@@ -27890,7 +27891,7 @@
     <w:uiPriority w:val="39"/>
     <w:semiHidden/>
     <w:unhideWhenUsed/>
-    <w:rsid w:val="009616FD"/>
+    <w:rsid w:val="00C272FC"/>
     <w:pPr>
       <w:spacing w:after="100"/>
       <w:ind w:left="220"/>
@@ -27904,7 +27905,7 @@
     <w:uiPriority w:val="39"/>
     <w:semiHidden/>
     <w:unhideWhenUsed/>
-    <w:rsid w:val="009616FD"/>
+    <w:rsid w:val="00C272FC"/>
     <w:pPr>
       <w:spacing w:after="100"/>
       <w:ind w:left="440"/>
@@ -27918,7 +27919,7 @@
     <w:uiPriority w:val="39"/>
     <w:semiHidden/>
     <w:unhideWhenUsed/>
-    <w:rsid w:val="009616FD"/>
+    <w:rsid w:val="00C272FC"/>
     <w:pPr>
       <w:spacing w:after="100"/>
       <w:ind w:left="660"/>
@@ -27932,7 +27933,7 @@
     <w:uiPriority w:val="39"/>
     <w:semiHidden/>
     <w:unhideWhenUsed/>
-    <w:rsid w:val="009616FD"/>
+    <w:rsid w:val="00C272FC"/>
     <w:pPr>
       <w:spacing w:after="100"/>
       <w:ind w:left="880"/>
@@ -27946,7 +27947,7 @@
     <w:uiPriority w:val="39"/>
     <w:semiHidden/>
     <w:unhideWhenUsed/>
-    <w:rsid w:val="009616FD"/>
+    <w:rsid w:val="00C272FC"/>
     <w:pPr>
       <w:spacing w:after="100"/>
       <w:ind w:left="1100"/>
@@ -27960,7 +27961,7 @@
     <w:uiPriority w:val="39"/>
     <w:semiHidden/>
     <w:unhideWhenUsed/>
-    <w:rsid w:val="009616FD"/>
+    <w:rsid w:val="00C272FC"/>
     <w:pPr>
       <w:spacing w:after="100"/>
       <w:ind w:left="1320"/>
@@ -27974,7 +27975,7 @@
     <w:uiPriority w:val="39"/>
     <w:semiHidden/>
     <w:unhideWhenUsed/>
-    <w:rsid w:val="009616FD"/>
+    <w:rsid w:val="00C272FC"/>
     <w:pPr>
       <w:spacing w:after="100"/>
       <w:ind w:left="1540"/>
@@ -27988,7 +27989,7 @@
     <w:uiPriority w:val="39"/>
     <w:semiHidden/>
     <w:unhideWhenUsed/>
-    <w:rsid w:val="009616FD"/>
+    <w:rsid w:val="00C272FC"/>
     <w:pPr>
       <w:spacing w:after="100"/>
       <w:ind w:left="1760"/>
@@ -28000,7 +28001,7 @@
     <w:uiPriority w:val="99"/>
     <w:semiHidden/>
     <w:unhideWhenUsed/>
-    <w:rsid w:val="009616FD"/>
+    <w:rsid w:val="00C272FC"/>
     <w:rPr>
       <w:rFonts w:ascii="Consolas" w:hAnsi="Consolas"/>
       <w:sz w:val="20"/>
@@ -28014,7 +28015,7 @@
     <w:uiPriority w:val="99"/>
     <w:semiHidden/>
     <w:unhideWhenUsed/>
-    <w:rsid w:val="009616FD"/>
+    <w:rsid w:val="00C272FC"/>
     <w:pPr>
       <w:ind w:left="220" w:hanging="220"/>
     </w:pPr>
@@ -28025,7 +28026,7 @@
     <w:uiPriority w:val="99"/>
     <w:semiHidden/>
     <w:unhideWhenUsed/>
-    <w:rsid w:val="009616FD"/>
+    <w:rsid w:val="00C272FC"/>
     <w:pPr>
       <w:pBdr>
         <w:top w:val="single" w:sz="2" w:space="10" w:color="4F81BD" w:themeColor="accent1"/>
@@ -28049,7 +28050,7 @@
     <w:uiPriority w:val="99"/>
     <w:semiHidden/>
     <w:unhideWhenUsed/>
-    <w:rsid w:val="009616FD"/>
+    <w:rsid w:val="00C272FC"/>
     <w:pPr>
       <w:spacing w:line="240" w:lineRule="auto"/>
     </w:pPr>
@@ -28065,7 +28066,7 @@
     <w:link w:val="Textodeglobo"/>
     <w:uiPriority w:val="99"/>
     <w:semiHidden/>
-    <w:rsid w:val="009616FD"/>
+    <w:rsid w:val="00C272FC"/>
     <w:rPr>
       <w:rFonts w:ascii="Segoe UI" w:hAnsi="Segoe UI" w:cs="Segoe UI"/>
       <w:sz w:val="18"/>
@@ -28077,7 +28078,7 @@
     <w:basedOn w:val="Fuentedeprrafopredeter"/>
     <w:uiPriority w:val="99"/>
     <w:semiHidden/>
-    <w:rsid w:val="009616FD"/>
+    <w:rsid w:val="00C272FC"/>
     <w:rPr>
       <w:rFonts w:ascii="Montserrat" w:hAnsi="Montserrat"/>
       <w:color w:val="808080"/>
@@ -28088,7 +28089,7 @@
     <w:basedOn w:val="Fuentedeprrafopredeter"/>
     <w:uiPriority w:val="22"/>
     <w:qFormat/>
-    <w:rsid w:val="009616FD"/>
+    <w:rsid w:val="00C272FC"/>
     <w:rPr>
       <w:rFonts w:ascii="Montserrat" w:hAnsi="Montserrat"/>
       <w:b/>
@@ -28102,7 +28103,7 @@
     <w:uiPriority w:val="99"/>
     <w:semiHidden/>
     <w:unhideWhenUsed/>
-    <w:rsid w:val="009616FD"/>
+    <w:rsid w:val="00C272FC"/>
     <w:pPr>
       <w:spacing w:after="120"/>
     </w:pPr>
@@ -28113,7 +28114,7 @@
     <w:link w:val="Textoindependiente"/>
     <w:uiPriority w:val="99"/>
     <w:semiHidden/>
-    <w:rsid w:val="009616FD"/>
+    <w:rsid w:val="00C272FC"/>
     <w:rPr>
       <w:rFonts w:ascii="Montserrat" w:hAnsi="Montserrat"/>
     </w:rPr>
@@ -28125,7 +28126,7 @@
     <w:uiPriority w:val="99"/>
     <w:semiHidden/>
     <w:unhideWhenUsed/>
-    <w:rsid w:val="009616FD"/>
+    <w:rsid w:val="00C272FC"/>
     <w:pPr>
       <w:spacing w:after="120" w:line="480" w:lineRule="auto"/>
     </w:pPr>
@@ -28136,7 +28137,7 @@
     <w:link w:val="Textoindependiente2"/>
     <w:uiPriority w:val="99"/>
     <w:semiHidden/>
-    <w:rsid w:val="009616FD"/>
+    <w:rsid w:val="00C272FC"/>
     <w:rPr>
       <w:rFonts w:ascii="Montserrat" w:hAnsi="Montserrat"/>
     </w:rPr>
@@ -28148,7 +28149,7 @@
     <w:uiPriority w:val="99"/>
     <w:semiHidden/>
     <w:unhideWhenUsed/>
-    <w:rsid w:val="009616FD"/>
+    <w:rsid w:val="00C272FC"/>
     <w:pPr>
       <w:spacing w:after="120"/>
     </w:pPr>
@@ -28163,7 +28164,7 @@
     <w:link w:val="Textoindependiente3"/>
     <w:uiPriority w:val="99"/>
     <w:semiHidden/>
-    <w:rsid w:val="009616FD"/>
+    <w:rsid w:val="00C272FC"/>
     <w:rPr>
       <w:rFonts w:ascii="Montserrat" w:hAnsi="Montserrat"/>
       <w:sz w:val="16"/>
@@ -28177,7 +28178,7 @@
     <w:uiPriority w:val="99"/>
     <w:semiHidden/>
     <w:unhideWhenUsed/>
-    <w:rsid w:val="009616FD"/>
+    <w:rsid w:val="00C272FC"/>
     <w:pPr>
       <w:spacing w:after="0"/>
       <w:ind w:firstLine="360"/>
@@ -28189,7 +28190,7 @@
     <w:link w:val="Textoindependienteprimerasangra"/>
     <w:uiPriority w:val="99"/>
     <w:semiHidden/>
-    <w:rsid w:val="009616FD"/>
+    <w:rsid w:val="00C272FC"/>
     <w:rPr>
       <w:rFonts w:ascii="Montserrat" w:hAnsi="Montserrat"/>
     </w:rPr>
@@ -28201,7 +28202,7 @@
     <w:uiPriority w:val="99"/>
     <w:semiHidden/>
     <w:unhideWhenUsed/>
-    <w:rsid w:val="009616FD"/>
+    <w:rsid w:val="00C272FC"/>
     <w:pPr>
       <w:spacing w:after="0"/>
       <w:ind w:left="360" w:firstLine="360"/>
@@ -28213,7 +28214,7 @@
     <w:link w:val="Textoindependienteprimerasangra2"/>
     <w:uiPriority w:val="99"/>
     <w:semiHidden/>
-    <w:rsid w:val="009616FD"/>
+    <w:rsid w:val="00C272FC"/>
     <w:rPr>
       <w:rFonts w:ascii="Montserrat" w:hAnsi="Montserrat"/>
     </w:rPr>
@@ -28224,7 +28225,7 @@
     <w:uiPriority w:val="99"/>
     <w:semiHidden/>
     <w:unhideWhenUsed/>
-    <w:rsid w:val="009616FD"/>
+    <w:rsid w:val="00C272FC"/>
     <w:pPr>
       <w:tabs>
         <w:tab w:val="left" w:pos="480"/>
@@ -28250,7 +28251,7 @@
     <w:link w:val="Textomacro"/>
     <w:uiPriority w:val="99"/>
     <w:semiHidden/>
-    <w:rsid w:val="009616FD"/>
+    <w:rsid w:val="00C272FC"/>
     <w:rPr>
       <w:rFonts w:ascii="Consolas" w:hAnsi="Consolas"/>
       <w:sz w:val="20"/>
@@ -28264,7 +28265,7 @@
     <w:uiPriority w:val="99"/>
     <w:semiHidden/>
     <w:unhideWhenUsed/>
-    <w:rsid w:val="009616FD"/>
+    <w:rsid w:val="00C272FC"/>
     <w:pPr>
       <w:spacing w:line="240" w:lineRule="auto"/>
     </w:pPr>
@@ -28279,7 +28280,7 @@
     <w:link w:val="Textonotaalfinal"/>
     <w:uiPriority w:val="99"/>
     <w:semiHidden/>
-    <w:rsid w:val="009616FD"/>
+    <w:rsid w:val="00C272FC"/>
     <w:rPr>
       <w:rFonts w:ascii="Montserrat" w:hAnsi="Montserrat"/>
       <w:sz w:val="20"/>
@@ -28293,7 +28294,7 @@
     <w:uiPriority w:val="99"/>
     <w:semiHidden/>
     <w:unhideWhenUsed/>
-    <w:rsid w:val="009616FD"/>
+    <w:rsid w:val="00C272FC"/>
     <w:pPr>
       <w:spacing w:line="240" w:lineRule="auto"/>
     </w:pPr>
@@ -28308,7 +28309,7 @@
     <w:link w:val="Textonotapie"/>
     <w:uiPriority w:val="99"/>
     <w:semiHidden/>
-    <w:rsid w:val="009616FD"/>
+    <w:rsid w:val="00C272FC"/>
     <w:rPr>
       <w:rFonts w:ascii="Montserrat" w:hAnsi="Montserrat"/>
       <w:sz w:val="20"/>
@@ -28322,7 +28323,7 @@
     <w:uiPriority w:val="99"/>
     <w:semiHidden/>
     <w:unhideWhenUsed/>
-    <w:rsid w:val="009616FD"/>
+    <w:rsid w:val="00C272FC"/>
     <w:pPr>
       <w:spacing w:line="240" w:lineRule="auto"/>
     </w:pPr>
@@ -28338,7 +28339,7 @@
     <w:link w:val="Textosinformato"/>
     <w:uiPriority w:val="99"/>
     <w:semiHidden/>
-    <w:rsid w:val="009616FD"/>
+    <w:rsid w:val="00C272FC"/>
     <w:rPr>
       <w:rFonts w:ascii="Consolas" w:hAnsi="Consolas"/>
       <w:sz w:val="21"/>
@@ -28352,7 +28353,7 @@
     <w:uiPriority w:val="99"/>
     <w:semiHidden/>
     <w:unhideWhenUsed/>
-    <w:rsid w:val="009616FD"/>
+    <w:rsid w:val="00C272FC"/>
     <w:rPr>
       <w:rFonts w:asciiTheme="majorHAnsi" w:eastAsiaTheme="majorEastAsia" w:hAnsiTheme="majorHAnsi" w:cstheme="majorBidi"/>
       <w:b/>
@@ -28364,7 +28365,7 @@
     <w:basedOn w:val="Fuentedeprrafopredeter"/>
     <w:uiPriority w:val="33"/>
     <w:qFormat/>
-    <w:rsid w:val="009616FD"/>
+    <w:rsid w:val="00C272FC"/>
     <w:rPr>
       <w:rFonts w:ascii="Montserrat" w:hAnsi="Montserrat"/>
       <w:b/>
@@ -28382,7 +28383,7 @@
     <w:semiHidden/>
     <w:unhideWhenUsed/>
     <w:qFormat/>
-    <w:rsid w:val="009616FD"/>
+    <w:rsid w:val="00C272FC"/>
     <w:pPr>
       <w:keepNext/>
       <w:keepLines/>
@@ -28414,7 +28415,7 @@
     <w:uiPriority w:val="99"/>
     <w:semiHidden/>
     <w:unhideWhenUsed/>
-    <w:rsid w:val="009616FD"/>
+    <w:rsid w:val="00C272FC"/>
     <w:rPr>
       <w:rFonts w:ascii="Montserrat" w:hAnsi="Montserrat"/>
       <w:i/>

</xml_diff>